<commit_message>
docs: move week 6 meeting 2 to Streamlit and add 6.2 folder
Pertemuan 2 Minggu 6 kini menjalankan CRUD lewat aplikasi Streamlit.
Folder "Minggu ke-6/6.2" berisi slide, lembar kerja (.docx/.pdf), dan
bahan awal kode-praktik (database.py, app.py). README, outline,
lembar kerja, dan slide Minggu 6 diperbarui sesuai alur baru.

Co-Authored-By: Claude Opus 5.5 <noreply@anthropic.com>
</commit_message>
<xml_diff>
--- a/Minggu ke-6/minggu-06-lembar-kerja-sqlite-crud.docx
+++ b/Minggu ke-6/minggu-06-lembar-kerja-sqlite-crud.docx
@@ -57,7 +57,7 @@
           <w:sz w:val="19"/>
           <w:szCs w:val="19"/>
         </w:rPr>
-        <w:t xml:space="preserve">Pemograman Bisnis &amp; Perancangan Sistem Administrasi · Senin 90 menit: membangun database. Selasa 90 menit: CRUD dari Python.</w:t>
+        <w:t xml:space="preserve">Pemograman Bisnis &amp; Perancangan Sistem Administrasi · Senin 90 menit: membangun database. Selasa 90 menit: CRUD dengan aplikasi Streamlit.</w:t>
       </w:r>
     </w:p>
     <w:tbl>
@@ -368,7 +368,7 @@
               <w:t xml:space="preserve">Petunjuk.  </w:t>
             </w:r>
             <w:r>
-              <w:t xml:space="preserve">Ikuti langkah sesuai urutan dan ketik kode persis seperti contoh. Setiap tahap punya kotak CEK: centang bila hasil Anda sama sebelum lanjut. Pakai data simulasi, jangan data pribadi pelanggan nyata. File akhir: kasir.db, buat_database.py, uji_aturan.py, database.py, main.py, dan lembar ini terisi.</w:t>
+              <w:t xml:space="preserve">Ikuti langkah sesuai urutan dan ketik kode persis seperti contoh. Setiap tahap punya kotak CEK: centang bila hasil Anda sama sebelum lanjut. Pakai data simulasi, jangan data pribadi pelanggan nyata. File akhir: kasir.db, buat_database.py, uji_aturan.py, database.py, app.py, dan lembar ini terisi.</w:t>
             </w:r>
           </w:p>
         </w:tc>
@@ -540,7 +540,7 @@
         <w:spacing w:after="60"/>
       </w:pPr>
       <w:r>
-        <w:t xml:space="preserve">Tidak perlu memasang apa pun: modul </w:t>
+        <w:t xml:space="preserve">Senin tidak perlu memasang apa pun: modul </w:t>
       </w:r>
       <w:r>
         <w:rPr>
@@ -552,7 +552,29 @@
         <w:t xml:space="preserve">sqlite3</w:t>
       </w:r>
       <w:r>
-        <w:t xml:space="preserve"> sudah bawaan Python.</w:t>
+        <w:t xml:space="preserve"> sudah bawaan Python. </w:t>
+      </w:r>
+      <w:r>
+        <w:rPr>
+          <w:b/>
+          <w:bCs/>
+        </w:rPr>
+        <w:t xml:space="preserve">Sebelum Selasa</w:t>
+      </w:r>
+      <w:r>
+        <w:t xml:space="preserve">, pasang Streamlit satu kali: </w:t>
+      </w:r>
+      <w:r>
+        <w:rPr>
+          <w:rFonts w:ascii="Consolas" w:cs="Consolas" w:eastAsia="Consolas" w:hAnsi="Consolas"/>
+          <w:color w:val="1B2A4A"/>
+          <w:sz w:val="19"/>
+          <w:szCs w:val="19"/>
+        </w:rPr>
+        <w:t xml:space="preserve">python -m pip install streamlit</w:t>
+      </w:r>
+      <w:r>
+        <w:t xml:space="preserve"> (perlu internet; lewati bila sudah terpasang sejak Minggu 5).</w:t>
       </w:r>
     </w:p>
     <w:p>
@@ -6222,7 +6244,7 @@
               <w:t xml:space="preserve">☐  </w:t>
             </w:r>
             <w:r>
-              <w:t xml:space="preserve">kasir.db, buat_database.py, dan uji_aturan.py tersimpan di folder minggu-06 untuk dipakai hari Selasa.</w:t>
+              <w:t xml:space="preserve">kasir.db, buat_database.py, dan uji_aturan.py tersimpan di folder minggu-06 untuk dipakai hari Selasa, dan Streamlit sudah terpasang.</w:t>
             </w:r>
           </w:p>
         </w:tc>
@@ -6247,7 +6269,7 @@
           <w:sz w:val="22"/>
           <w:szCs w:val="22"/>
         </w:rPr>
-        <w:t xml:space="preserve">BAGIAN B · SELASA — Python menyimpan dan mengelola data</w:t>
+        <w:t xml:space="preserve">BAGIAN B · SELASA — CRUD lewat aplikasi Streamlit</w:t>
       </w:r>
     </w:p>
     <w:p>
@@ -6255,7 +6277,65 @@
         <w:spacing w:after="100"/>
       </w:pPr>
       <w:r>
-        <w:t xml:space="preserve">Minggu ini kita memisahkan tugas ke file yang berbeda. Kelas jalur Streamlit Minggu 5 membuat database.py yang sama persis; fungsinya dipanggil dari app.py.</w:t>
+        <w:t xml:space="preserve">Hari ini data dikelola lewat </w:t>
+      </w:r>
+      <w:r>
+        <w:rPr>
+          <w:b/>
+          <w:bCs/>
+        </w:rPr>
+        <w:t xml:space="preserve">halaman web Streamlit</w:t>
+      </w:r>
+      <w:r>
+        <w:t xml:space="preserve">. Tampilan dan penyimpanan dipisah ke file yang berbeda: </w:t>
+      </w:r>
+      <w:r>
+        <w:rPr>
+          <w:rFonts w:ascii="Consolas" w:cs="Consolas" w:eastAsia="Consolas" w:hAnsi="Consolas"/>
+          <w:color w:val="1B2A4A"/>
+          <w:sz w:val="19"/>
+          <w:szCs w:val="19"/>
+        </w:rPr>
+        <w:t xml:space="preserve">app.py</w:t>
+      </w:r>
+      <w:r>
+        <w:t xml:space="preserve"> hanya memanggil fungsi di </w:t>
+      </w:r>
+      <w:r>
+        <w:rPr>
+          <w:rFonts w:ascii="Consolas" w:cs="Consolas" w:eastAsia="Consolas" w:hAnsi="Consolas"/>
+          <w:color w:val="1B2A4A"/>
+          <w:sz w:val="19"/>
+          <w:szCs w:val="19"/>
+        </w:rPr>
+        <w:t xml:space="preserve">database.py</w:t>
+      </w:r>
+      <w:r>
+        <w:t xml:space="preserve">. Kelas yang belum dapat memasang Streamlit memakai jalur cadangan menu terminal </w:t>
+      </w:r>
+      <w:r>
+        <w:rPr>
+          <w:rFonts w:ascii="Consolas" w:cs="Consolas" w:eastAsia="Consolas" w:hAnsi="Consolas"/>
+          <w:color w:val="1B2A4A"/>
+          <w:sz w:val="19"/>
+          <w:szCs w:val="19"/>
+        </w:rPr>
+        <w:t xml:space="preserve">main.py</w:t>
+      </w:r>
+      <w:r>
+        <w:t xml:space="preserve"> sesuai arahan dosen; </w:t>
+      </w:r>
+      <w:r>
+        <w:rPr>
+          <w:rFonts w:ascii="Consolas" w:cs="Consolas" w:eastAsia="Consolas" w:hAnsi="Consolas"/>
+          <w:color w:val="1B2A4A"/>
+          <w:sz w:val="19"/>
+          <w:szCs w:val="19"/>
+        </w:rPr>
+        <w:t xml:space="preserve">database.py</w:t>
+      </w:r>
+      <w:r>
+        <w:t xml:space="preserve"> tetap sama.</w:t>
       </w:r>
     </w:p>
     <w:tbl>
@@ -6373,7 +6453,7 @@
                 <w:sz w:val="19"/>
                 <w:szCs w:val="19"/>
               </w:rPr>
-              <w:t xml:space="preserve">main.py</w:t>
+              <w:t xml:space="preserve">app.py</w:t>
             </w:r>
           </w:p>
         </w:tc>
@@ -6401,7 +6481,7 @@
                 <w:sz w:val="19"/>
                 <w:szCs w:val="19"/>
               </w:rPr>
-              <w:t xml:space="preserve">Tampilan terminal: menu, input, dan print</w:t>
+              <w:t xml:space="preserve">BARU: tampilan Streamlit — formulir, tombol, pesan, dan tabel produk</w:t>
             </w:r>
           </w:p>
         </w:tc>
@@ -6437,7 +6517,7 @@
                 <w:sz w:val="19"/>
                 <w:szCs w:val="19"/>
               </w:rPr>
-              <w:t xml:space="preserve">logika_bisnis.py</w:t>
+              <w:t xml:space="preserve">database.py</w:t>
             </w:r>
           </w:p>
         </w:tc>
@@ -6465,7 +6545,7 @@
                 <w:sz w:val="19"/>
                 <w:szCs w:val="19"/>
               </w:rPr>
-              <w:t xml:space="preserve">Perhitungan dari Minggu 5 (subtotal, diskon). Tidak diubah minggu ini.</w:t>
+              <w:t xml:space="preserve">BARU: menyimpan dan mengambil data dari kasir.db. Tidak berisi kode Streamlit.</w:t>
             </w:r>
           </w:p>
         </w:tc>
@@ -6501,7 +6581,7 @@
                 <w:sz w:val="19"/>
                 <w:szCs w:val="19"/>
               </w:rPr>
-              <w:t xml:space="preserve">database.py</w:t>
+              <w:t xml:space="preserve">logika_bisnis.py</w:t>
             </w:r>
           </w:p>
         </w:tc>
@@ -6529,7 +6609,7 @@
                 <w:sz w:val="19"/>
                 <w:szCs w:val="19"/>
               </w:rPr>
-              <w:t xml:space="preserve">BARU: menyimpan dan mengambil data dari kasir.db</w:t>
+              <w:t xml:space="preserve">Perhitungan dari Minggu 5 (subtotal, diskon). Tidak diubah minggu ini.</w:t>
             </w:r>
           </w:p>
         </w:tc>
@@ -6549,7 +6629,7 @@
           <w:sz w:val="24"/>
           <w:szCs w:val="24"/>
         </w:rPr>
-        <w:t xml:space="preserve">B1. Tulis database.py</w:t>
+        <w:t xml:space="preserve">B1. Pahami database.py</w:t>
       </w:r>
       <w:r>
         <w:rPr>
@@ -6559,7 +6639,7 @@
           <w:sz w:val="18"/>
           <w:szCs w:val="18"/>
         </w:rPr>
-        <w:t xml:space="preserve">   menit 10–45</w:t>
+        <w:t xml:space="preserve">   menit 10–20</w:t>
       </w:r>
     </w:p>
     <w:p>
@@ -6567,12 +6647,12 @@
         <w:pStyle w:val="ListParagraph"/>
         <w:numPr>
           <w:ilvl w:val="0"/>
-          <w:numId w:val="5"/>
+          <w:numId w:val="6"/>
         </w:numPr>
         <w:spacing w:after="60"/>
       </w:pPr>
       <w:r>
-        <w:t xml:space="preserve">Buat file baru </w:t>
+        <w:t xml:space="preserve">Salin </w:t>
       </w:r>
       <w:r>
         <w:rPr>
@@ -6584,7 +6664,7 @@
         <w:t xml:space="preserve">database.py</w:t>
       </w:r>
       <w:r>
-        <w:t xml:space="preserve"> di folder yang sama dengan </w:t>
+        <w:t xml:space="preserve"> dan </w:t>
       </w:r>
       <w:r>
         <w:rPr>
@@ -6593,6 +6673,30 @@
           <w:sz w:val="19"/>
           <w:szCs w:val="19"/>
         </w:rPr>
+        <w:t xml:space="preserve">app.py</w:t>
+      </w:r>
+      <w:r>
+        <w:t xml:space="preserve"> dari dosen ke folder </w:t>
+      </w:r>
+      <w:r>
+        <w:rPr>
+          <w:rFonts w:ascii="Consolas" w:cs="Consolas" w:eastAsia="Consolas" w:hAnsi="Consolas"/>
+          <w:color w:val="1B2A4A"/>
+          <w:sz w:val="19"/>
+          <w:szCs w:val="19"/>
+        </w:rPr>
+        <w:t xml:space="preserve">minggu-06</w:t>
+      </w:r>
+      <w:r>
+        <w:t xml:space="preserve">, satu folder dengan </w:t>
+      </w:r>
+      <w:r>
+        <w:rPr>
+          <w:rFonts w:ascii="Consolas" w:cs="Consolas" w:eastAsia="Consolas" w:hAnsi="Consolas"/>
+          <w:color w:val="1B2A4A"/>
+          <w:sz w:val="19"/>
+          <w:szCs w:val="19"/>
+        </w:rPr>
         <w:t xml:space="preserve">kasir.db</w:t>
       </w:r>
       <w:r>
@@ -6604,12 +6708,24 @@
         <w:pStyle w:val="ListParagraph"/>
         <w:numPr>
           <w:ilvl w:val="0"/>
-          <w:numId w:val="5"/>
+          <w:numId w:val="6"/>
         </w:numPr>
         <w:spacing w:after="60"/>
       </w:pPr>
       <w:r>
-        <w:t xml:space="preserve">Ketik kode berikut. Perhatikan pola yang selalu sama: buka koneksi → try → execute → commit → finally close.</w:t>
+        <w:t xml:space="preserve">Baca </w:t>
+      </w:r>
+      <w:r>
+        <w:rPr>
+          <w:rFonts w:ascii="Consolas" w:cs="Consolas" w:eastAsia="Consolas" w:hAnsi="Consolas"/>
+          <w:color w:val="1B2A4A"/>
+          <w:sz w:val="19"/>
+          <w:szCs w:val="19"/>
+        </w:rPr>
+        <w:t xml:space="preserve">database.py</w:t>
+      </w:r>
+      <w:r>
+        <w:t xml:space="preserve">. Perhatikan pola yang selalu sama: buka koneksi → try → execute → commit → finally close.</w:t>
       </w:r>
     </w:p>
     <w:p>
@@ -6617,7 +6733,7 @@
         <w:pStyle w:val="ListParagraph"/>
         <w:numPr>
           <w:ilvl w:val="0"/>
-          <w:numId w:val="5"/>
+          <w:numId w:val="6"/>
         </w:numPr>
         <w:spacing w:after="60"/>
       </w:pPr>
@@ -6686,7 +6802,7 @@
                 <w:sz w:val="17"/>
                 <w:szCs w:val="17"/>
               </w:rPr>
-              <w:t xml:space="preserve">database.py</w:t>
+              <w:t xml:space="preserve">database.py (bagian yang sudah jadi)</w:t>
             </w:r>
           </w:p>
           <w:p>
@@ -7352,11 +7468,6 @@
         </w:tc>
       </w:tr>
     </w:tbl>
-    <w:p>
-      <w:pPr>
-        <w:spacing w:after="60"/>
-      </w:pPr>
-    </w:p>
     <w:p>
       <w:pPr>
         <w:spacing w:after="60"/>
@@ -7467,7 +7578,7 @@
           <w:sz w:val="18"/>
           <w:szCs w:val="18"/>
         </w:rPr>
-        <w:t xml:space="preserve">   menit 45–55</w:t>
+        <w:t xml:space="preserve">   menit 20–35</w:t>
       </w:r>
     </w:p>
     <w:p>
@@ -7475,7 +7586,7 @@
         <w:spacing w:after="100"/>
       </w:pPr>
       <w:r>
-        <w:t xml:space="preserve">Tulis fungsi </w:t>
+        <w:t xml:space="preserve">Fungsi </w:t>
       </w:r>
       <w:r>
         <w:rPr>
@@ -7499,7 +7610,19 @@
         <w:t xml:space="preserve">database.py</w:t>
       </w:r>
       <w:r>
-        <w:t xml:space="preserve">. Contoh polanya adalah </w:t>
+        <w:t xml:space="preserve"> masih berisi </w:t>
+      </w:r>
+      <w:r>
+        <w:rPr>
+          <w:rFonts w:ascii="Consolas" w:cs="Consolas" w:eastAsia="Consolas" w:hAnsi="Consolas"/>
+          <w:color w:val="1B2A4A"/>
+          <w:sz w:val="19"/>
+          <w:szCs w:val="19"/>
+        </w:rPr>
+        <w:t xml:space="preserve">raise NotImplementedError</w:t>
+      </w:r>
+      <w:r>
+        <w:t xml:space="preserve">. Ganti isinya dengan pola seperti </w:t>
       </w:r>
       <w:r>
         <w:rPr>
@@ -7605,11 +7728,6 @@
         <w:spacing w:after="60"/>
       </w:pPr>
     </w:p>
-    <w:p>
-      <w:pPr>
-        <w:spacing w:after="60"/>
-      </w:pPr>
-    </w:p>
     <w:tbl>
       <w:tblPr>
         <w:tblW w:type="dxa" w:w="9638"/>
@@ -7714,7 +7832,7 @@
           <w:sz w:val="24"/>
           <w:szCs w:val="24"/>
         </w:rPr>
-        <w:t xml:space="preserve">B3. Tulis main.py (menu terminal)</w:t>
+        <w:t xml:space="preserve">B3. Jalankan dan lengkapi app.py (Streamlit)</w:t>
       </w:r>
       <w:r>
         <w:rPr>
@@ -7724,15 +7842,20 @@
           <w:sz w:val="18"/>
           <w:szCs w:val="18"/>
         </w:rPr>
-        <w:t xml:space="preserve">   menit 25–70</w:t>
-      </w:r>
-    </w:p>
-    <w:p>
-      <w:pPr>
-        <w:spacing w:after="100"/>
-      </w:pPr>
-      <w:r>
-        <w:t xml:space="preserve">Buat </w:t>
+        <w:t xml:space="preserve">   menit 35–70</w:t>
+      </w:r>
+    </w:p>
+    <w:p>
+      <w:pPr>
+        <w:pStyle w:val="ListParagraph"/>
+        <w:numPr>
+          <w:ilvl w:val="0"/>
+          <w:numId w:val="7"/>
+        </w:numPr>
+        <w:spacing w:after="60"/>
+      </w:pPr>
+      <w:r>
+        <w:t xml:space="preserve">Periksa Streamlit: </w:t>
       </w:r>
       <w:r>
         <w:rPr>
@@ -7741,10 +7864,10 @@
           <w:sz w:val="19"/>
           <w:szCs w:val="19"/>
         </w:rPr>
-        <w:t xml:space="preserve">main.py</w:t>
-      </w:r>
-      <w:r>
-        <w:t xml:space="preserve"> di folder yang sama. Program ini menampilkan menu dan memanggil fungsi di </w:t>
+        <w:t xml:space="preserve">python -m streamlit version</w:t>
+      </w:r>
+      <w:r>
+        <w:t xml:space="preserve">. Bila belum ada, jalankan </w:t>
       </w:r>
       <w:r>
         <w:rPr>
@@ -7753,10 +7876,23 @@
           <w:sz w:val="19"/>
           <w:szCs w:val="19"/>
         </w:rPr>
-        <w:t xml:space="preserve">database.py</w:t>
-      </w:r>
-      <w:r>
-        <w:t xml:space="preserve">. Dua </w:t>
+        <w:t xml:space="preserve">python -m pip install streamlit</w:t>
+      </w:r>
+      <w:r>
+        <w:t xml:space="preserve">.</w:t>
+      </w:r>
+    </w:p>
+    <w:p>
+      <w:pPr>
+        <w:pStyle w:val="ListParagraph"/>
+        <w:numPr>
+          <w:ilvl w:val="0"/>
+          <w:numId w:val="7"/>
+        </w:numPr>
+        <w:spacing w:after="60"/>
+      </w:pPr>
+      <w:r>
+        <w:t xml:space="preserve">Jalankan aplikasi: </w:t>
       </w:r>
       <w:r>
         <w:rPr>
@@ -7765,10 +7901,20 @@
           <w:sz w:val="19"/>
           <w:szCs w:val="19"/>
         </w:rPr>
-        <w:t xml:space="preserve">except</w:t>
-      </w:r>
-      <w:r>
-        <w:t xml:space="preserve"> di bawah adalah dua lapis penjaga: </w:t>
+        <w:t xml:space="preserve">python -m streamlit run app.py</w:t>
+      </w:r>
+      <w:r>
+        <w:t xml:space="preserve">. Browser membuka halaman </w:t>
+      </w:r>
+      <w:r>
+        <w:rPr>
+          <w:b/>
+          <w:bCs/>
+        </w:rPr>
+        <w:t xml:space="preserve">Kelola Produk</w:t>
+      </w:r>
+      <w:r>
+        <w:t xml:space="preserve">. Bila tidak terbuka, salin alamat </w:t>
       </w:r>
       <w:r>
         <w:rPr>
@@ -7777,22 +7923,56 @@
           <w:sz w:val="19"/>
           <w:szCs w:val="19"/>
         </w:rPr>
-        <w:t xml:space="preserve">ValueError</w:t>
-      </w:r>
-      <w:r>
-        <w:t xml:space="preserve"> untuk isian bukan angka, </w:t>
-      </w:r>
-      <w:r>
-        <w:rPr>
-          <w:rFonts w:ascii="Consolas" w:cs="Consolas" w:eastAsia="Consolas" w:hAnsi="Consolas"/>
-          <w:color w:val="1B2A4A"/>
-          <w:sz w:val="19"/>
-          <w:szCs w:val="19"/>
-        </w:rPr>
-        <w:t xml:space="preserve">IntegrityError</w:t>
-      </w:r>
-      <w:r>
-        <w:t xml:space="preserve"> bila database menolak.</w:t>
+        <w:t xml:space="preserve">http://localhost:8501</w:t>
+      </w:r>
+      <w:r>
+        <w:t xml:space="preserve"> dari terminal.</w:t>
+      </w:r>
+    </w:p>
+    <w:p>
+      <w:pPr>
+        <w:pStyle w:val="ListParagraph"/>
+        <w:numPr>
+          <w:ilvl w:val="0"/>
+          <w:numId w:val="7"/>
+        </w:numPr>
+        <w:spacing w:after="60"/>
+      </w:pPr>
+      <w:r>
+        <w:t xml:space="preserve">Coba tambah satu produk, lalu lihat tabel </w:t>
+      </w:r>
+      <w:r>
+        <w:rPr>
+          <w:b/>
+          <w:bCs/>
+        </w:rPr>
+        <w:t xml:space="preserve">Daftar produk</w:t>
+      </w:r>
+      <w:r>
+        <w:t xml:space="preserve"> di bagian bawah. Tombol ubah harga dan hapus masih menampilkan pesan “belum dilengkapi”.</w:t>
+      </w:r>
+    </w:p>
+    <w:p>
+      <w:pPr>
+        <w:pStyle w:val="ListParagraph"/>
+        <w:numPr>
+          <w:ilvl w:val="0"/>
+          <w:numId w:val="7"/>
+        </w:numPr>
+        <w:spacing w:after="60"/>
+      </w:pPr>
+      <w:r>
+        <w:t xml:space="preserve">Untuk menghentikan aplikasi, klik terminal lalu tekan </w:t>
+      </w:r>
+      <w:r>
+        <w:rPr>
+          <w:b/>
+          <w:bCs/>
+        </w:rPr>
+        <w:t xml:space="preserve">Ctrl+C</w:t>
+      </w:r>
+      <w:r>
+        <w:t xml:space="preserve">.</w:t>
       </w:r>
     </w:p>
     <w:tbl>
@@ -7844,7 +8024,7 @@
                 <w:sz w:val="17"/>
                 <w:szCs w:val="17"/>
               </w:rPr>
-              <w:t xml:space="preserve">main.py</w:t>
+              <w:t xml:space="preserve">app.py (bagian yang sudah jadi)</w:t>
             </w:r>
           </w:p>
           <w:p>
@@ -7874,6 +8054,51 @@
                 <w:sz w:val="17"/>
                 <w:szCs w:val="17"/>
               </w:rPr>
+              <w:t xml:space="preserve"> </w:t>
+            </w:r>
+          </w:p>
+          <w:p>
+            <w:pPr>
+              <w:spacing w:after="0" w:line="240"/>
+              <w:ind w:left="0"/>
+            </w:pPr>
+            <w:r>
+              <w:rPr>
+                <w:rFonts w:ascii="Consolas" w:cs="Consolas" w:eastAsia="Consolas" w:hAnsi="Consolas"/>
+                <w:color w:val="1F2937"/>
+                <w:sz w:val="17"/>
+                <w:szCs w:val="17"/>
+              </w:rPr>
+              <w:t xml:space="preserve">import streamlit as st</w:t>
+            </w:r>
+          </w:p>
+          <w:p>
+            <w:pPr>
+              <w:spacing w:after="0" w:line="240"/>
+              <w:ind w:left="0"/>
+            </w:pPr>
+            <w:r>
+              <w:rPr>
+                <w:rFonts w:ascii="Consolas" w:cs="Consolas" w:eastAsia="Consolas" w:hAnsi="Consolas"/>
+                <w:color w:val="1F2937"/>
+                <w:sz w:val="17"/>
+                <w:szCs w:val="17"/>
+              </w:rPr>
+              <w:t xml:space="preserve"> </w:t>
+            </w:r>
+          </w:p>
+          <w:p>
+            <w:pPr>
+              <w:spacing w:after="0" w:line="240"/>
+              <w:ind w:left="0"/>
+            </w:pPr>
+            <w:r>
+              <w:rPr>
+                <w:rFonts w:ascii="Consolas" w:cs="Consolas" w:eastAsia="Consolas" w:hAnsi="Consolas"/>
+                <w:color w:val="1F2937"/>
+                <w:sz w:val="17"/>
+                <w:szCs w:val="17"/>
+              </w:rPr>
               <w:t xml:space="preserve">import database</w:t>
             </w:r>
           </w:p>
@@ -7904,6 +8129,21 @@
                 <w:sz w:val="17"/>
                 <w:szCs w:val="17"/>
               </w:rPr>
+              <w:t xml:space="preserve">st.title("Kelola Produk")</w:t>
+            </w:r>
+          </w:p>
+          <w:p>
+            <w:pPr>
+              <w:spacing w:after="0" w:line="240"/>
+              <w:ind w:left="0"/>
+            </w:pPr>
+            <w:r>
+              <w:rPr>
+                <w:rFonts w:ascii="Consolas" w:cs="Consolas" w:eastAsia="Consolas" w:hAnsi="Consolas"/>
+                <w:color w:val="1F2937"/>
+                <w:sz w:val="17"/>
+                <w:szCs w:val="17"/>
+              </w:rPr>
               <w:t xml:space="preserve"> </w:t>
             </w:r>
           </w:p>
@@ -7919,7 +8159,37 @@
                 <w:sz w:val="17"/>
                 <w:szCs w:val="17"/>
               </w:rPr>
-              <w:t xml:space="preserve">def tampilkan_produk():</w:t>
+              <w:t xml:space="preserve"># ---------- CREATE: tambah produk (sudah jadi) ----------</w:t>
+            </w:r>
+          </w:p>
+          <w:p>
+            <w:pPr>
+              <w:spacing w:after="0" w:line="240"/>
+              <w:ind w:left="0"/>
+            </w:pPr>
+            <w:r>
+              <w:rPr>
+                <w:rFonts w:ascii="Consolas" w:cs="Consolas" w:eastAsia="Consolas" w:hAnsi="Consolas"/>
+                <w:color w:val="1F2937"/>
+                <w:sz w:val="17"/>
+                <w:szCs w:val="17"/>
+              </w:rPr>
+              <w:t xml:space="preserve">st.subheader("Tambah produk")</w:t>
+            </w:r>
+          </w:p>
+          <w:p>
+            <w:pPr>
+              <w:spacing w:after="0" w:line="240"/>
+              <w:ind w:left="0"/>
+            </w:pPr>
+            <w:r>
+              <w:rPr>
+                <w:rFonts w:ascii="Consolas" w:cs="Consolas" w:eastAsia="Consolas" w:hAnsi="Consolas"/>
+                <w:color w:val="1F2937"/>
+                <w:sz w:val="17"/>
+                <w:szCs w:val="17"/>
+              </w:rPr>
+              <w:t xml:space="preserve">with st.form("form_tambah", clear_on_submit=True):</w:t>
             </w:r>
           </w:p>
           <w:p>
@@ -7934,7 +8204,7 @@
                 <w:sz w:val="17"/>
                 <w:szCs w:val="17"/>
               </w:rPr>
-              <w:t xml:space="preserve">print("\nID | Nama | Harga | Stok")</w:t>
+              <w:t xml:space="preserve">nama = st.text_input("Nama produk")</w:t>
             </w:r>
           </w:p>
           <w:p>
@@ -7949,7 +8219,82 @@
                 <w:sz w:val="17"/>
                 <w:szCs w:val="17"/>
               </w:rPr>
-              <w:t xml:space="preserve">for id_produk, nama, harga, stok in database.daftar_produk():</w:t>
+              <w:t xml:space="preserve">harga = st.number_input("Harga (Rp, angka bulat)", step=1, value=0)</w:t>
+            </w:r>
+          </w:p>
+          <w:p>
+            <w:pPr>
+              <w:spacing w:after="0" w:line="240"/>
+              <w:ind w:left="400"/>
+            </w:pPr>
+            <w:r>
+              <w:rPr>
+                <w:rFonts w:ascii="Consolas" w:cs="Consolas" w:eastAsia="Consolas" w:hAnsi="Consolas"/>
+                <w:color w:val="1F2937"/>
+                <w:sz w:val="17"/>
+                <w:szCs w:val="17"/>
+              </w:rPr>
+              <w:t xml:space="preserve">stok = st.number_input("Stok awal", min_value=0, step=1, value=0)</w:t>
+            </w:r>
+          </w:p>
+          <w:p>
+            <w:pPr>
+              <w:spacing w:after="0" w:line="240"/>
+              <w:ind w:left="400"/>
+            </w:pPr>
+            <w:r>
+              <w:rPr>
+                <w:rFonts w:ascii="Consolas" w:cs="Consolas" w:eastAsia="Consolas" w:hAnsi="Consolas"/>
+                <w:color w:val="1F2937"/>
+                <w:sz w:val="17"/>
+                <w:szCs w:val="17"/>
+              </w:rPr>
+              <w:t xml:space="preserve">tombol_tambah = st.form_submit_button("Simpan produk")</w:t>
+            </w:r>
+          </w:p>
+          <w:p>
+            <w:pPr>
+              <w:spacing w:after="0" w:line="240"/>
+              <w:ind w:left="0"/>
+            </w:pPr>
+            <w:r>
+              <w:rPr>
+                <w:rFonts w:ascii="Consolas" w:cs="Consolas" w:eastAsia="Consolas" w:hAnsi="Consolas"/>
+                <w:color w:val="1F2937"/>
+                <w:sz w:val="17"/>
+                <w:szCs w:val="17"/>
+              </w:rPr>
+              <w:t xml:space="preserve"> </w:t>
+            </w:r>
+          </w:p>
+          <w:p>
+            <w:pPr>
+              <w:spacing w:after="0" w:line="240"/>
+              <w:ind w:left="0"/>
+            </w:pPr>
+            <w:r>
+              <w:rPr>
+                <w:rFonts w:ascii="Consolas" w:cs="Consolas" w:eastAsia="Consolas" w:hAnsi="Consolas"/>
+                <w:color w:val="1F2937"/>
+                <w:sz w:val="17"/>
+                <w:szCs w:val="17"/>
+              </w:rPr>
+              <w:t xml:space="preserve">if tombol_tambah:</w:t>
+            </w:r>
+          </w:p>
+          <w:p>
+            <w:pPr>
+              <w:spacing w:after="0" w:line="240"/>
+              <w:ind w:left="400"/>
+            </w:pPr>
+            <w:r>
+              <w:rPr>
+                <w:rFonts w:ascii="Consolas" w:cs="Consolas" w:eastAsia="Consolas" w:hAnsi="Consolas"/>
+                <w:color w:val="1F2937"/>
+                <w:sz w:val="17"/>
+                <w:szCs w:val="17"/>
+              </w:rPr>
+              <w:t xml:space="preserve">if nama.strip() == "":</w:t>
             </w:r>
           </w:p>
           <w:p>
@@ -7964,7 +8309,97 @@
                 <w:sz w:val="17"/>
                 <w:szCs w:val="17"/>
               </w:rPr>
-              <w:t xml:space="preserve">print(id_produk, "|", nama, "|", harga, "|", stok)</w:t>
+              <w:t xml:space="preserve">st.error("Nama produk wajib diisi.")          # validasi Python</w:t>
+            </w:r>
+          </w:p>
+          <w:p>
+            <w:pPr>
+              <w:spacing w:after="0" w:line="240"/>
+              <w:ind w:left="400"/>
+            </w:pPr>
+            <w:r>
+              <w:rPr>
+                <w:rFonts w:ascii="Consolas" w:cs="Consolas" w:eastAsia="Consolas" w:hAnsi="Consolas"/>
+                <w:color w:val="1F2937"/>
+                <w:sz w:val="17"/>
+                <w:szCs w:val="17"/>
+              </w:rPr>
+              <w:t xml:space="preserve">else:</w:t>
+            </w:r>
+          </w:p>
+          <w:p>
+            <w:pPr>
+              <w:spacing w:after="0" w:line="240"/>
+              <w:ind w:left="800"/>
+            </w:pPr>
+            <w:r>
+              <w:rPr>
+                <w:rFonts w:ascii="Consolas" w:cs="Consolas" w:eastAsia="Consolas" w:hAnsi="Consolas"/>
+                <w:color w:val="1F2937"/>
+                <w:sz w:val="17"/>
+                <w:szCs w:val="17"/>
+              </w:rPr>
+              <w:t xml:space="preserve">try:</w:t>
+            </w:r>
+          </w:p>
+          <w:p>
+            <w:pPr>
+              <w:spacing w:after="0" w:line="240"/>
+              <w:ind w:left="1200"/>
+            </w:pPr>
+            <w:r>
+              <w:rPr>
+                <w:rFonts w:ascii="Consolas" w:cs="Consolas" w:eastAsia="Consolas" w:hAnsi="Consolas"/>
+                <w:color w:val="1F2937"/>
+                <w:sz w:val="17"/>
+                <w:szCs w:val="17"/>
+              </w:rPr>
+              <w:t xml:space="preserve">database.tambah_produk(nama.strip(), harga, stok)</w:t>
+            </w:r>
+          </w:p>
+          <w:p>
+            <w:pPr>
+              <w:spacing w:after="0" w:line="240"/>
+              <w:ind w:left="1200"/>
+            </w:pPr>
+            <w:r>
+              <w:rPr>
+                <w:rFonts w:ascii="Consolas" w:cs="Consolas" w:eastAsia="Consolas" w:hAnsi="Consolas"/>
+                <w:color w:val="1F2937"/>
+                <w:sz w:val="17"/>
+                <w:szCs w:val="17"/>
+              </w:rPr>
+              <w:t xml:space="preserve">st.success(f"Produk {nama.strip()} tersimpan.")</w:t>
+            </w:r>
+          </w:p>
+          <w:p>
+            <w:pPr>
+              <w:spacing w:after="0" w:line="240"/>
+              <w:ind w:left="800"/>
+            </w:pPr>
+            <w:r>
+              <w:rPr>
+                <w:rFonts w:ascii="Consolas" w:cs="Consolas" w:eastAsia="Consolas" w:hAnsi="Consolas"/>
+                <w:color w:val="1F2937"/>
+                <w:sz w:val="17"/>
+                <w:szCs w:val="17"/>
+              </w:rPr>
+              <w:t xml:space="preserve">except sqlite3.IntegrityError as e:</w:t>
+            </w:r>
+          </w:p>
+          <w:p>
+            <w:pPr>
+              <w:spacing w:after="0" w:line="240"/>
+              <w:ind w:left="1200"/>
+            </w:pPr>
+            <w:r>
+              <w:rPr>
+                <w:rFonts w:ascii="Consolas" w:cs="Consolas" w:eastAsia="Consolas" w:hAnsi="Consolas"/>
+                <w:color w:val="1F2937"/>
+                <w:sz w:val="17"/>
+                <w:szCs w:val="17"/>
+              </w:rPr>
+              <w:t xml:space="preserve">st.error(f"Database menolak data: {e}")  # aturan database</w:t>
             </w:r>
           </w:p>
           <w:p>
@@ -7994,6 +8429,21 @@
                 <w:sz w:val="17"/>
                 <w:szCs w:val="17"/>
               </w:rPr>
+              <w:t xml:space="preserve"># ... bagian ubah harga (Latihan E1) dan hapus (Latihan E2) ...</w:t>
+            </w:r>
+          </w:p>
+          <w:p>
+            <w:pPr>
+              <w:spacing w:after="0" w:line="240"/>
+              <w:ind w:left="0"/>
+            </w:pPr>
+            <w:r>
+              <w:rPr>
+                <w:rFonts w:ascii="Consolas" w:cs="Consolas" w:eastAsia="Consolas" w:hAnsi="Consolas"/>
+                <w:color w:val="1F2937"/>
+                <w:sz w:val="17"/>
+                <w:szCs w:val="17"/>
+              </w:rPr>
               <w:t xml:space="preserve"> </w:t>
             </w:r>
           </w:p>
@@ -8009,7 +8459,37 @@
                 <w:sz w:val="17"/>
                 <w:szCs w:val="17"/>
               </w:rPr>
-              <w:t xml:space="preserve">while True:</w:t>
+              <w:t xml:space="preserve"># ---------- READ: daftar produk (sudah jadi, paling bawah) ----------</w:t>
+            </w:r>
+          </w:p>
+          <w:p>
+            <w:pPr>
+              <w:spacing w:after="0" w:line="240"/>
+              <w:ind w:left="0"/>
+            </w:pPr>
+            <w:r>
+              <w:rPr>
+                <w:rFonts w:ascii="Consolas" w:cs="Consolas" w:eastAsia="Consolas" w:hAnsi="Consolas"/>
+                <w:color w:val="1F2937"/>
+                <w:sz w:val="17"/>
+                <w:szCs w:val="17"/>
+              </w:rPr>
+              <w:t xml:space="preserve">st.subheader("Daftar produk")</w:t>
+            </w:r>
+          </w:p>
+          <w:p>
+            <w:pPr>
+              <w:spacing w:after="0" w:line="240"/>
+              <w:ind w:left="0"/>
+            </w:pPr>
+            <w:r>
+              <w:rPr>
+                <w:rFonts w:ascii="Consolas" w:cs="Consolas" w:eastAsia="Consolas" w:hAnsi="Consolas"/>
+                <w:color w:val="1F2937"/>
+                <w:sz w:val="17"/>
+                <w:szCs w:val="17"/>
+              </w:rPr>
+              <w:t xml:space="preserve">st.dataframe(</w:t>
             </w:r>
           </w:p>
           <w:p>
@@ -8024,7 +8504,37 @@
                 <w:sz w:val="17"/>
                 <w:szCs w:val="17"/>
               </w:rPr>
-              <w:t xml:space="preserve">print("\n=== KELOLA PRODUK ===")</w:t>
+              <w:t xml:space="preserve">[</w:t>
+            </w:r>
+          </w:p>
+          <w:p>
+            <w:pPr>
+              <w:spacing w:after="0" w:line="240"/>
+              <w:ind w:left="800"/>
+            </w:pPr>
+            <w:r>
+              <w:rPr>
+                <w:rFonts w:ascii="Consolas" w:cs="Consolas" w:eastAsia="Consolas" w:hAnsi="Consolas"/>
+                <w:color w:val="1F2937"/>
+                <w:sz w:val="17"/>
+                <w:szCs w:val="17"/>
+              </w:rPr>
+              <w:t xml:space="preserve">{"ID": id_produk, "Nama": nama, "Harga": harga, "Stok": stok}</w:t>
+            </w:r>
+          </w:p>
+          <w:p>
+            <w:pPr>
+              <w:spacing w:after="0" w:line="240"/>
+              <w:ind w:left="800"/>
+            </w:pPr>
+            <w:r>
+              <w:rPr>
+                <w:rFonts w:ascii="Consolas" w:cs="Consolas" w:eastAsia="Consolas" w:hAnsi="Consolas"/>
+                <w:color w:val="1F2937"/>
+                <w:sz w:val="17"/>
+                <w:szCs w:val="17"/>
+              </w:rPr>
+              <w:t xml:space="preserve">for id_produk, nama, harga, stok in database.daftar_produk()</w:t>
             </w:r>
           </w:p>
           <w:p>
@@ -8039,7 +8549,7 @@
                 <w:sz w:val="17"/>
                 <w:szCs w:val="17"/>
               </w:rPr>
-              <w:t xml:space="preserve">print("1. Tampilkan  2. Tambah  3. Ubah harga  4. Hapus  0. Keluar")</w:t>
+              <w:t xml:space="preserve">],</w:t>
             </w:r>
           </w:p>
           <w:p>
@@ -8054,517 +8564,27 @@
                 <w:sz w:val="17"/>
                 <w:szCs w:val="17"/>
               </w:rPr>
-              <w:t xml:space="preserve">pilihan = input("Pilih menu: ")</w:t>
-            </w:r>
-          </w:p>
-          <w:p>
-            <w:pPr>
-              <w:spacing w:after="0" w:line="240"/>
-              <w:ind w:left="400"/>
-            </w:pPr>
-            <w:r>
-              <w:rPr>
-                <w:rFonts w:ascii="Consolas" w:cs="Consolas" w:eastAsia="Consolas" w:hAnsi="Consolas"/>
-                <w:color w:val="1F2937"/>
-                <w:sz w:val="17"/>
-                <w:szCs w:val="17"/>
-              </w:rPr>
-              <w:t xml:space="preserve">try:</w:t>
-            </w:r>
-          </w:p>
-          <w:p>
-            <w:pPr>
-              <w:spacing w:after="0" w:line="240"/>
-              <w:ind w:left="800"/>
-            </w:pPr>
-            <w:r>
-              <w:rPr>
-                <w:rFonts w:ascii="Consolas" w:cs="Consolas" w:eastAsia="Consolas" w:hAnsi="Consolas"/>
-                <w:color w:val="1F2937"/>
-                <w:sz w:val="17"/>
-                <w:szCs w:val="17"/>
-              </w:rPr>
-              <w:t xml:space="preserve">if pilihan == "1":</w:t>
-            </w:r>
-          </w:p>
-          <w:p>
-            <w:pPr>
-              <w:spacing w:after="0" w:line="240"/>
-              <w:ind w:left="1200"/>
-            </w:pPr>
-            <w:r>
-              <w:rPr>
-                <w:rFonts w:ascii="Consolas" w:cs="Consolas" w:eastAsia="Consolas" w:hAnsi="Consolas"/>
-                <w:color w:val="1F2937"/>
-                <w:sz w:val="17"/>
-                <w:szCs w:val="17"/>
-              </w:rPr>
-              <w:t xml:space="preserve">tampilkan_produk()</w:t>
-            </w:r>
-          </w:p>
-          <w:p>
-            <w:pPr>
-              <w:spacing w:after="0" w:line="240"/>
-              <w:ind w:left="800"/>
-            </w:pPr>
-            <w:r>
-              <w:rPr>
-                <w:rFonts w:ascii="Consolas" w:cs="Consolas" w:eastAsia="Consolas" w:hAnsi="Consolas"/>
-                <w:color w:val="1F2937"/>
-                <w:sz w:val="17"/>
-                <w:szCs w:val="17"/>
-              </w:rPr>
-              <w:t xml:space="preserve">elif pilihan == "2":</w:t>
-            </w:r>
-          </w:p>
-          <w:p>
-            <w:pPr>
-              <w:spacing w:after="0" w:line="240"/>
-              <w:ind w:left="1200"/>
-            </w:pPr>
-            <w:r>
-              <w:rPr>
-                <w:rFonts w:ascii="Consolas" w:cs="Consolas" w:eastAsia="Consolas" w:hAnsi="Consolas"/>
-                <w:color w:val="1F2937"/>
-                <w:sz w:val="17"/>
-                <w:szCs w:val="17"/>
-              </w:rPr>
-              <w:t xml:space="preserve">nama = input("Nama produk: ")</w:t>
-            </w:r>
-          </w:p>
-          <w:p>
-            <w:pPr>
-              <w:spacing w:after="0" w:line="240"/>
-              <w:ind w:left="1200"/>
-            </w:pPr>
-            <w:r>
-              <w:rPr>
-                <w:rFonts w:ascii="Consolas" w:cs="Consolas" w:eastAsia="Consolas" w:hAnsi="Consolas"/>
-                <w:color w:val="1F2937"/>
-                <w:sz w:val="17"/>
-                <w:szCs w:val="17"/>
-              </w:rPr>
-              <w:t xml:space="preserve">harga = int(input("Harga (angka bulat, tanpa Rp/titik): "))</w:t>
-            </w:r>
-          </w:p>
-          <w:p>
-            <w:pPr>
-              <w:spacing w:after="0" w:line="240"/>
-              <w:ind w:left="1200"/>
-            </w:pPr>
-            <w:r>
-              <w:rPr>
-                <w:rFonts w:ascii="Consolas" w:cs="Consolas" w:eastAsia="Consolas" w:hAnsi="Consolas"/>
-                <w:color w:val="1F2937"/>
-                <w:sz w:val="17"/>
-                <w:szCs w:val="17"/>
-              </w:rPr>
-              <w:t xml:space="preserve">stok = int(input("Stok awal: "))</w:t>
-            </w:r>
-          </w:p>
-          <w:p>
-            <w:pPr>
-              <w:spacing w:after="0" w:line="240"/>
-              <w:ind w:left="1200"/>
-            </w:pPr>
-            <w:r>
-              <w:rPr>
-                <w:rFonts w:ascii="Consolas" w:cs="Consolas" w:eastAsia="Consolas" w:hAnsi="Consolas"/>
-                <w:color w:val="1F2937"/>
-                <w:sz w:val="17"/>
-                <w:szCs w:val="17"/>
-              </w:rPr>
-              <w:t xml:space="preserve">database.tambah_produk(nama, harga, stok)</w:t>
-            </w:r>
-          </w:p>
-          <w:p>
-            <w:pPr>
-              <w:spacing w:after="0" w:line="240"/>
-              <w:ind w:left="1200"/>
-            </w:pPr>
-            <w:r>
-              <w:rPr>
-                <w:rFonts w:ascii="Consolas" w:cs="Consolas" w:eastAsia="Consolas" w:hAnsi="Consolas"/>
-                <w:color w:val="1F2937"/>
-                <w:sz w:val="17"/>
-                <w:szCs w:val="17"/>
-              </w:rPr>
-              <w:t xml:space="preserve">print("Produk tersimpan.")</w:t>
-            </w:r>
-          </w:p>
-          <w:p>
-            <w:pPr>
-              <w:spacing w:after="0" w:line="240"/>
-              <w:ind w:left="800"/>
-            </w:pPr>
-            <w:r>
-              <w:rPr>
-                <w:rFonts w:ascii="Consolas" w:cs="Consolas" w:eastAsia="Consolas" w:hAnsi="Consolas"/>
-                <w:color w:val="1F2937"/>
-                <w:sz w:val="17"/>
-                <w:szCs w:val="17"/>
-              </w:rPr>
-              <w:t xml:space="preserve">elif pilihan == "3":</w:t>
-            </w:r>
-          </w:p>
-          <w:p>
-            <w:pPr>
-              <w:spacing w:after="0" w:line="240"/>
-              <w:ind w:left="1200"/>
-            </w:pPr>
-            <w:r>
-              <w:rPr>
-                <w:rFonts w:ascii="Consolas" w:cs="Consolas" w:eastAsia="Consolas" w:hAnsi="Consolas"/>
-                <w:color w:val="1F2937"/>
-                <w:sz w:val="17"/>
-                <w:szCs w:val="17"/>
-              </w:rPr>
-              <w:t xml:space="preserve">id_produk = int(input("ID produk: "))</w:t>
-            </w:r>
-          </w:p>
-          <w:p>
-            <w:pPr>
-              <w:spacing w:after="0" w:line="240"/>
-              <w:ind w:left="1200"/>
-            </w:pPr>
-            <w:r>
-              <w:rPr>
-                <w:rFonts w:ascii="Consolas" w:cs="Consolas" w:eastAsia="Consolas" w:hAnsi="Consolas"/>
-                <w:color w:val="1F2937"/>
-                <w:sz w:val="17"/>
-                <w:szCs w:val="17"/>
-              </w:rPr>
-              <w:t xml:space="preserve">harga_baru = int(input("Harga baru: "))</w:t>
-            </w:r>
-          </w:p>
-          <w:p>
-            <w:pPr>
-              <w:spacing w:after="0" w:line="240"/>
-              <w:ind w:left="1200"/>
-            </w:pPr>
-            <w:r>
-              <w:rPr>
-                <w:rFonts w:ascii="Consolas" w:cs="Consolas" w:eastAsia="Consolas" w:hAnsi="Consolas"/>
-                <w:color w:val="1F2937"/>
-                <w:sz w:val="17"/>
-                <w:szCs w:val="17"/>
-              </w:rPr>
-              <w:t xml:space="preserve">if database.ubah_harga(id_produk, harga_baru) == 0:</w:t>
-            </w:r>
-          </w:p>
-          <w:p>
-            <w:pPr>
-              <w:spacing w:after="0" w:line="240"/>
-              <w:ind w:left="1600"/>
-            </w:pPr>
-            <w:r>
-              <w:rPr>
-                <w:rFonts w:ascii="Consolas" w:cs="Consolas" w:eastAsia="Consolas" w:hAnsi="Consolas"/>
-                <w:color w:val="1F2937"/>
-                <w:sz w:val="17"/>
-                <w:szCs w:val="17"/>
-              </w:rPr>
-              <w:t xml:space="preserve">print("ID tidak ditemukan.")</w:t>
-            </w:r>
-          </w:p>
-          <w:p>
-            <w:pPr>
-              <w:spacing w:after="0" w:line="240"/>
-              <w:ind w:left="1200"/>
-            </w:pPr>
-            <w:r>
-              <w:rPr>
-                <w:rFonts w:ascii="Consolas" w:cs="Consolas" w:eastAsia="Consolas" w:hAnsi="Consolas"/>
-                <w:color w:val="1F2937"/>
-                <w:sz w:val="17"/>
-                <w:szCs w:val="17"/>
-              </w:rPr>
-              <w:t xml:space="preserve">else:</w:t>
-            </w:r>
-          </w:p>
-          <w:p>
-            <w:pPr>
-              <w:spacing w:after="0" w:line="240"/>
-              <w:ind w:left="1600"/>
-            </w:pPr>
-            <w:r>
-              <w:rPr>
-                <w:rFonts w:ascii="Consolas" w:cs="Consolas" w:eastAsia="Consolas" w:hAnsi="Consolas"/>
-                <w:color w:val="1F2937"/>
-                <w:sz w:val="17"/>
-                <w:szCs w:val="17"/>
-              </w:rPr>
-              <w:t xml:space="preserve">print("Harga diubah.")</w:t>
-            </w:r>
-          </w:p>
-          <w:p>
-            <w:pPr>
-              <w:spacing w:after="0" w:line="240"/>
-              <w:ind w:left="800"/>
-            </w:pPr>
-            <w:r>
-              <w:rPr>
-                <w:rFonts w:ascii="Consolas" w:cs="Consolas" w:eastAsia="Consolas" w:hAnsi="Consolas"/>
-                <w:color w:val="1F2937"/>
-                <w:sz w:val="17"/>
-                <w:szCs w:val="17"/>
-              </w:rPr>
-              <w:t xml:space="preserve">elif pilihan == "4":</w:t>
-            </w:r>
-          </w:p>
-          <w:p>
-            <w:pPr>
-              <w:spacing w:after="0" w:line="240"/>
-              <w:ind w:left="1200"/>
-            </w:pPr>
-            <w:r>
-              <w:rPr>
-                <w:rFonts w:ascii="Consolas" w:cs="Consolas" w:eastAsia="Consolas" w:hAnsi="Consolas"/>
-                <w:color w:val="1F2937"/>
-                <w:sz w:val="17"/>
-                <w:szCs w:val="17"/>
-              </w:rPr>
-              <w:t xml:space="preserve">id_produk = int(input("ID produk yang dihapus: "))</w:t>
-            </w:r>
-          </w:p>
-          <w:p>
-            <w:pPr>
-              <w:spacing w:after="0" w:line="240"/>
-              <w:ind w:left="1200"/>
-            </w:pPr>
-            <w:r>
-              <w:rPr>
-                <w:rFonts w:ascii="Consolas" w:cs="Consolas" w:eastAsia="Consolas" w:hAnsi="Consolas"/>
-                <w:color w:val="1F2937"/>
-                <w:sz w:val="17"/>
-                <w:szCs w:val="17"/>
-              </w:rPr>
-              <w:t xml:space="preserve">if input("Yakin hapus? (y/n): ").lower() == "y":</w:t>
-            </w:r>
-          </w:p>
-          <w:p>
-            <w:pPr>
-              <w:spacing w:after="0" w:line="240"/>
-              <w:ind w:left="1600"/>
-            </w:pPr>
-            <w:r>
-              <w:rPr>
-                <w:rFonts w:ascii="Consolas" w:cs="Consolas" w:eastAsia="Consolas" w:hAnsi="Consolas"/>
-                <w:color w:val="1F2937"/>
-                <w:sz w:val="17"/>
-                <w:szCs w:val="17"/>
-              </w:rPr>
-              <w:t xml:space="preserve">if database.hapus_produk(id_produk) == 0:</w:t>
-            </w:r>
-          </w:p>
-          <w:p>
-            <w:pPr>
-              <w:spacing w:after="0" w:line="240"/>
-              <w:ind w:left="2000"/>
-            </w:pPr>
-            <w:r>
-              <w:rPr>
-                <w:rFonts w:ascii="Consolas" w:cs="Consolas" w:eastAsia="Consolas" w:hAnsi="Consolas"/>
-                <w:color w:val="1F2937"/>
-                <w:sz w:val="17"/>
-                <w:szCs w:val="17"/>
-              </w:rPr>
-              <w:t xml:space="preserve">print("ID tidak ditemukan.")</w:t>
-            </w:r>
-          </w:p>
-          <w:p>
-            <w:pPr>
-              <w:spacing w:after="0" w:line="240"/>
-              <w:ind w:left="1600"/>
-            </w:pPr>
-            <w:r>
-              <w:rPr>
-                <w:rFonts w:ascii="Consolas" w:cs="Consolas" w:eastAsia="Consolas" w:hAnsi="Consolas"/>
-                <w:color w:val="1F2937"/>
-                <w:sz w:val="17"/>
-                <w:szCs w:val="17"/>
-              </w:rPr>
-              <w:t xml:space="preserve">else:</w:t>
-            </w:r>
-          </w:p>
-          <w:p>
-            <w:pPr>
-              <w:spacing w:after="0" w:line="240"/>
-              <w:ind w:left="2000"/>
-            </w:pPr>
-            <w:r>
-              <w:rPr>
-                <w:rFonts w:ascii="Consolas" w:cs="Consolas" w:eastAsia="Consolas" w:hAnsi="Consolas"/>
-                <w:color w:val="1F2937"/>
-                <w:sz w:val="17"/>
-                <w:szCs w:val="17"/>
-              </w:rPr>
-              <w:t xml:space="preserve">print("Produk dihapus.")</w:t>
-            </w:r>
-          </w:p>
-          <w:p>
-            <w:pPr>
-              <w:spacing w:after="0" w:line="240"/>
-              <w:ind w:left="800"/>
-            </w:pPr>
-            <w:r>
-              <w:rPr>
-                <w:rFonts w:ascii="Consolas" w:cs="Consolas" w:eastAsia="Consolas" w:hAnsi="Consolas"/>
-                <w:color w:val="1F2937"/>
-                <w:sz w:val="17"/>
-                <w:szCs w:val="17"/>
-              </w:rPr>
-              <w:t xml:space="preserve">elif pilihan == "0":</w:t>
-            </w:r>
-          </w:p>
-          <w:p>
-            <w:pPr>
-              <w:spacing w:after="0" w:line="240"/>
-              <w:ind w:left="1200"/>
-            </w:pPr>
-            <w:r>
-              <w:rPr>
-                <w:rFonts w:ascii="Consolas" w:cs="Consolas" w:eastAsia="Consolas" w:hAnsi="Consolas"/>
-                <w:color w:val="1F2937"/>
-                <w:sz w:val="17"/>
-                <w:szCs w:val="17"/>
-              </w:rPr>
-              <w:t xml:space="preserve">print("Selesai.")</w:t>
-            </w:r>
-          </w:p>
-          <w:p>
-            <w:pPr>
-              <w:spacing w:after="0" w:line="240"/>
-              <w:ind w:left="1200"/>
-            </w:pPr>
-            <w:r>
-              <w:rPr>
-                <w:rFonts w:ascii="Consolas" w:cs="Consolas" w:eastAsia="Consolas" w:hAnsi="Consolas"/>
-                <w:color w:val="1F2937"/>
-                <w:sz w:val="17"/>
-                <w:szCs w:val="17"/>
-              </w:rPr>
-              <w:t xml:space="preserve">break</w:t>
-            </w:r>
-          </w:p>
-          <w:p>
-            <w:pPr>
-              <w:spacing w:after="0" w:line="240"/>
-              <w:ind w:left="800"/>
-            </w:pPr>
-            <w:r>
-              <w:rPr>
-                <w:rFonts w:ascii="Consolas" w:cs="Consolas" w:eastAsia="Consolas" w:hAnsi="Consolas"/>
-                <w:color w:val="1F2937"/>
-                <w:sz w:val="17"/>
-                <w:szCs w:val="17"/>
-              </w:rPr>
-              <w:t xml:space="preserve">else:</w:t>
-            </w:r>
-          </w:p>
-          <w:p>
-            <w:pPr>
-              <w:spacing w:after="0" w:line="240"/>
-              <w:ind w:left="1200"/>
-            </w:pPr>
-            <w:r>
-              <w:rPr>
-                <w:rFonts w:ascii="Consolas" w:cs="Consolas" w:eastAsia="Consolas" w:hAnsi="Consolas"/>
-                <w:color w:val="1F2937"/>
-                <w:sz w:val="17"/>
-                <w:szCs w:val="17"/>
-              </w:rPr>
-              <w:t xml:space="preserve">print("Menu tidak dikenal.")</w:t>
-            </w:r>
-          </w:p>
-          <w:p>
-            <w:pPr>
-              <w:spacing w:after="0" w:line="240"/>
-              <w:ind w:left="400"/>
-            </w:pPr>
-            <w:r>
-              <w:rPr>
-                <w:rFonts w:ascii="Consolas" w:cs="Consolas" w:eastAsia="Consolas" w:hAnsi="Consolas"/>
-                <w:color w:val="1F2937"/>
-                <w:sz w:val="17"/>
-                <w:szCs w:val="17"/>
-              </w:rPr>
-              <w:t xml:space="preserve">except ValueError:</w:t>
-            </w:r>
-          </w:p>
-          <w:p>
-            <w:pPr>
-              <w:spacing w:after="0" w:line="240"/>
-              <w:ind w:left="800"/>
-            </w:pPr>
-            <w:r>
-              <w:rPr>
-                <w:rFonts w:ascii="Consolas" w:cs="Consolas" w:eastAsia="Consolas" w:hAnsi="Consolas"/>
-                <w:color w:val="1F2937"/>
-                <w:sz w:val="17"/>
-                <w:szCs w:val="17"/>
-              </w:rPr>
-              <w:t xml:space="preserve">print("Harus diisi angka bulat.")</w:t>
-            </w:r>
-          </w:p>
-          <w:p>
-            <w:pPr>
-              <w:spacing w:after="0" w:line="240"/>
-              <w:ind w:left="400"/>
-            </w:pPr>
-            <w:r>
-              <w:rPr>
-                <w:rFonts w:ascii="Consolas" w:cs="Consolas" w:eastAsia="Consolas" w:hAnsi="Consolas"/>
-                <w:color w:val="1F2937"/>
-                <w:sz w:val="17"/>
-                <w:szCs w:val="17"/>
-              </w:rPr>
-              <w:t xml:space="preserve">except sqlite3.IntegrityError as e:</w:t>
-            </w:r>
-          </w:p>
-          <w:p>
-            <w:pPr>
-              <w:spacing w:after="0" w:line="240"/>
-              <w:ind w:left="800"/>
-            </w:pPr>
-            <w:r>
-              <w:rPr>
-                <w:rFonts w:ascii="Consolas" w:cs="Consolas" w:eastAsia="Consolas" w:hAnsi="Consolas"/>
-                <w:color w:val="1F2937"/>
-                <w:sz w:val="17"/>
-                <w:szCs w:val="17"/>
-              </w:rPr>
-              <w:t xml:space="preserve">print("Database menolak:", e)</w:t>
+              <w:t xml:space="preserve">hide_index=True,</w:t>
+            </w:r>
+          </w:p>
+          <w:p>
+            <w:pPr>
+              <w:spacing w:after="0" w:line="240"/>
+              <w:ind w:left="0"/>
+            </w:pPr>
+            <w:r>
+              <w:rPr>
+                <w:rFonts w:ascii="Consolas" w:cs="Consolas" w:eastAsia="Consolas" w:hAnsi="Consolas"/>
+                <w:color w:val="1F2937"/>
+                <w:sz w:val="17"/>
+                <w:szCs w:val="17"/>
+              </w:rPr>
+              <w:t xml:space="preserve">)</w:t>
             </w:r>
           </w:p>
         </w:tc>
       </w:tr>
     </w:tbl>
-    <w:p>
-      <w:pPr>
-        <w:spacing w:after="60"/>
-      </w:pPr>
-    </w:p>
-    <w:p>
-      <w:pPr>
-        <w:spacing w:after="100"/>
-      </w:pPr>
-      <w:r>
-        <w:t xml:space="preserve">Jalankan dengan </w:t>
-      </w:r>
-      <w:r>
-        <w:rPr>
-          <w:rFonts w:ascii="Consolas" w:cs="Consolas" w:eastAsia="Consolas" w:hAnsi="Consolas"/>
-          <w:color w:val="1B2A4A"/>
-          <w:sz w:val="19"/>
-          <w:szCs w:val="19"/>
-        </w:rPr>
-        <w:t xml:space="preserve">python main.py</w:t>
-      </w:r>
-      <w:r>
-        <w:t xml:space="preserve">. Pilih menu 1 untuk melihat data awal: Buku Tulis (ID 1), Pulpen (ID 2), dan Map Plastik (ID 3).</w:t>
-      </w:r>
-    </w:p>
     <w:p>
       <w:pPr>
         <w:spacing w:after="60"/>
@@ -8593,6 +8613,443 @@
           <w:tcPr>
             <w:tcW w:type="dxa" w:w="9638"/>
             <w:tcBorders>
+              <w:top w:val="single" w:color="F2A93B" w:sz="4"/>
+              <w:left w:val="single" w:color="F2A93B" w:sz="4"/>
+              <w:bottom w:val="single" w:color="F2A93B" w:sz="4"/>
+              <w:right w:val="single" w:color="F2A93B" w:sz="4"/>
+            </w:tcBorders>
+            <w:shd w:fill="FDF1DC" w:color="auto" w:val="clear"/>
+            <w:tcMar>
+              <w:top w:type="dxa" w:w="100"/>
+              <w:left w:type="dxa" w:w="160"/>
+              <w:bottom w:type="dxa" w:w="100"/>
+              <w:right w:type="dxa" w:w="160"/>
+            </w:tcMar>
+          </w:tcPr>
+          <w:p>
+            <w:r>
+              <w:rPr>
+                <w:b/>
+                <w:bCs/>
+                <w:color w:val="1B2A4A"/>
+              </w:rPr>
+              <w:t xml:space="preserve">Cara kerja Streamlit.  </w:t>
+            </w:r>
+            <w:r>
+              <w:t xml:space="preserve">Setiap kali tombol ditekan, </w:t>
+            </w:r>
+            <w:r>
+              <w:rPr>
+                <w:b/>
+                <w:bCs/>
+              </w:rPr>
+              <w:t xml:space="preserve">seluruh</w:t>
+            </w:r>
+            <w:r>
+              <w:t xml:space="preserve"> </w:t>
+            </w:r>
+            <w:r>
+              <w:rPr>
+                <w:rFonts w:ascii="Consolas" w:cs="Consolas" w:eastAsia="Consolas" w:hAnsi="Consolas"/>
+                <w:color w:val="1B2A4A"/>
+                <w:sz w:val="19"/>
+                <w:szCs w:val="19"/>
+              </w:rPr>
+              <w:t xml:space="preserve">app.py</w:t>
+            </w:r>
+            <w:r>
+              <w:t xml:space="preserve"> dijalankan ulang dari atas. </w:t>
+            </w:r>
+            <w:r>
+              <w:rPr>
+                <w:rFonts w:ascii="Consolas" w:cs="Consolas" w:eastAsia="Consolas" w:hAnsi="Consolas"/>
+                <w:color w:val="1B2A4A"/>
+                <w:sz w:val="19"/>
+                <w:szCs w:val="19"/>
+              </w:rPr>
+              <w:t xml:space="preserve">st.form</w:t>
+            </w:r>
+            <w:r>
+              <w:t xml:space="preserve"> mengumpulkan isian sampai tombol formulir ditekan. </w:t>
+            </w:r>
+            <w:r>
+              <w:rPr>
+                <w:rFonts w:ascii="Consolas" w:cs="Consolas" w:eastAsia="Consolas" w:hAnsi="Consolas"/>
+                <w:color w:val="1B2A4A"/>
+                <w:sz w:val="19"/>
+                <w:szCs w:val="19"/>
+              </w:rPr>
+              <w:t xml:space="preserve">st.number_input(step=1)</w:t>
+            </w:r>
+            <w:r>
+              <w:t xml:space="preserve"> hanya menerima angka bulat, jadi isian </w:t>
+            </w:r>
+            <w:r>
+              <w:rPr>
+                <w:rFonts w:ascii="Consolas" w:cs="Consolas" w:eastAsia="Consolas" w:hAnsi="Consolas"/>
+                <w:color w:val="1B2A4A"/>
+                <w:sz w:val="19"/>
+                <w:szCs w:val="19"/>
+              </w:rPr>
+              <w:t xml:space="preserve">abc</w:t>
+            </w:r>
+            <w:r>
+              <w:t xml:space="preserve"> tidak bisa diketik. Tabel diletakkan paling bawah agar dibaca setelah perubahan diproses.</w:t>
+            </w:r>
+          </w:p>
+        </w:tc>
+      </w:tr>
+    </w:tbl>
+    <w:p>
+      <w:pPr>
+        <w:spacing w:after="60"/>
+      </w:pPr>
+    </w:p>
+    <w:p>
+      <w:pPr>
+        <w:spacing w:after="100"/>
+      </w:pPr>
+      <w:r>
+        <w:rPr>
+          <w:b/>
+          <w:bCs/>
+        </w:rPr>
+        <w:t xml:space="preserve">Latihan E1 – Ubah harga.</w:t>
+      </w:r>
+      <w:r>
+        <w:t xml:space="preserve"> Ganti baris </w:t>
+      </w:r>
+      <w:r>
+        <w:rPr>
+          <w:rFonts w:ascii="Consolas" w:cs="Consolas" w:eastAsia="Consolas" w:hAnsi="Consolas"/>
+          <w:color w:val="1B2A4A"/>
+          <w:sz w:val="19"/>
+          <w:szCs w:val="19"/>
+        </w:rPr>
+        <w:t xml:space="preserve">st.info(...)</w:t>
+      </w:r>
+      <w:r>
+        <w:t xml:space="preserve"> pada bagian ubah harga. Panggil </w:t>
+      </w:r>
+      <w:r>
+        <w:rPr>
+          <w:rFonts w:ascii="Consolas" w:cs="Consolas" w:eastAsia="Consolas" w:hAnsi="Consolas"/>
+          <w:color w:val="1B2A4A"/>
+          <w:sz w:val="19"/>
+          <w:szCs w:val="19"/>
+        </w:rPr>
+        <w:t xml:space="preserve">database.ubah_harga(id_ubah, harga_baru)</w:t>
+      </w:r>
+      <w:r>
+        <w:t xml:space="preserve">: hasil 0 → </w:t>
+      </w:r>
+      <w:r>
+        <w:rPr>
+          <w:rFonts w:ascii="Consolas" w:cs="Consolas" w:eastAsia="Consolas" w:hAnsi="Consolas"/>
+          <w:color w:val="1B2A4A"/>
+          <w:sz w:val="19"/>
+          <w:szCs w:val="19"/>
+        </w:rPr>
+        <w:t xml:space="preserve">st.warning</w:t>
+      </w:r>
+      <w:r>
+        <w:t xml:space="preserve"> (ID tidak ditemukan), selainnya → </w:t>
+      </w:r>
+      <w:r>
+        <w:rPr>
+          <w:rFonts w:ascii="Consolas" w:cs="Consolas" w:eastAsia="Consolas" w:hAnsi="Consolas"/>
+          <w:color w:val="1B2A4A"/>
+          <w:sz w:val="19"/>
+          <w:szCs w:val="19"/>
+        </w:rPr>
+        <w:t xml:space="preserve">st.success</w:t>
+      </w:r>
+      <w:r>
+        <w:t xml:space="preserve">. Tangkap </w:t>
+      </w:r>
+      <w:r>
+        <w:rPr>
+          <w:rFonts w:ascii="Consolas" w:cs="Consolas" w:eastAsia="Consolas" w:hAnsi="Consolas"/>
+          <w:color w:val="1B2A4A"/>
+          <w:sz w:val="19"/>
+          <w:szCs w:val="19"/>
+        </w:rPr>
+        <w:t xml:space="preserve">sqlite3.IntegrityError</w:t>
+      </w:r>
+      <w:r>
+        <w:t xml:space="preserve"> dengan </w:t>
+      </w:r>
+      <w:r>
+        <w:rPr>
+          <w:rFonts w:ascii="Consolas" w:cs="Consolas" w:eastAsia="Consolas" w:hAnsi="Consolas"/>
+          <w:color w:val="1B2A4A"/>
+          <w:sz w:val="19"/>
+          <w:szCs w:val="19"/>
+        </w:rPr>
+        <w:t xml:space="preserve">st.error</w:t>
+      </w:r>
+      <w:r>
+        <w:t xml:space="preserve">.</w:t>
+      </w:r>
+    </w:p>
+    <w:tbl>
+      <w:tblPr>
+        <w:tblW w:type="dxa" w:w="9638"/>
+        <w:tblBorders>
+          <w:top w:val="single" w:color="auto" w:sz="4"/>
+          <w:left w:val="single" w:color="auto" w:sz="4"/>
+          <w:bottom w:val="single" w:color="auto" w:sz="4"/>
+          <w:right w:val="single" w:color="auto" w:sz="4"/>
+          <w:insideH w:val="single" w:color="auto" w:sz="4"/>
+          <w:insideV w:val="single" w:color="auto" w:sz="4"/>
+        </w:tblBorders>
+      </w:tblPr>
+      <w:tblGrid>
+        <w:gridCol w:w="9638"/>
+      </w:tblGrid>
+      <w:tr>
+        <w:trPr>
+          <w:trHeight w:val="2400" w:hRule="exact"/>
+        </w:trPr>
+        <w:tc>
+          <w:tcPr>
+            <w:tcW w:type="dxa" w:w="9638"/>
+            <w:tcBorders>
+              <w:top w:val="single" w:color="9AA8BC" w:sz="4"/>
+              <w:left w:val="single" w:color="9AA8BC" w:sz="4"/>
+              <w:bottom w:val="single" w:color="9AA8BC" w:sz="4"/>
+              <w:right w:val="single" w:color="9AA8BC" w:sz="4"/>
+            </w:tcBorders>
+            <w:tcMar>
+              <w:top w:type="dxa" w:w="80"/>
+              <w:left w:type="dxa" w:w="160"/>
+              <w:bottom w:type="dxa" w:w="80"/>
+              <w:right w:type="dxa" w:w="160"/>
+            </w:tcMar>
+          </w:tcPr>
+          <w:p>
+            <w:r>
+              <w:rPr>
+                <w:i/>
+                <w:iCs/>
+                <w:color w:val="5B6B82"/>
+                <w:sz w:val="17"/>
+                <w:szCs w:val="17"/>
+              </w:rPr>
+              <w:t xml:space="preserve">Tulis kode pengganti st.info pada bagian ubah harga di sini, lalu salin ke app.py.</w:t>
+            </w:r>
+          </w:p>
+        </w:tc>
+      </w:tr>
+    </w:tbl>
+    <w:p>
+      <w:pPr>
+        <w:spacing w:after="60"/>
+      </w:pPr>
+    </w:p>
+    <w:p>
+      <w:pPr>
+        <w:spacing w:after="100"/>
+      </w:pPr>
+      <w:r>
+        <w:rPr>
+          <w:b/>
+          <w:bCs/>
+        </w:rPr>
+        <w:t xml:space="preserve">Latihan E2 – Hapus.</w:t>
+      </w:r>
+      <w:r>
+        <w:t xml:space="preserve"> Ganti baris </w:t>
+      </w:r>
+      <w:r>
+        <w:rPr>
+          <w:rFonts w:ascii="Consolas" w:cs="Consolas" w:eastAsia="Consolas" w:hAnsi="Consolas"/>
+          <w:color w:val="1B2A4A"/>
+          <w:sz w:val="19"/>
+          <w:szCs w:val="19"/>
+        </w:rPr>
+        <w:t xml:space="preserve">st.info(...)</w:t>
+      </w:r>
+      <w:r>
+        <w:t xml:space="preserve"> pada bagian hapus. Jika kotak konfirmasi </w:t>
+      </w:r>
+      <w:r>
+        <w:rPr>
+          <w:rFonts w:ascii="Consolas" w:cs="Consolas" w:eastAsia="Consolas" w:hAnsi="Consolas"/>
+          <w:color w:val="1B2A4A"/>
+          <w:sz w:val="19"/>
+          <w:szCs w:val="19"/>
+        </w:rPr>
+        <w:t xml:space="preserve">yakin</w:t>
+      </w:r>
+      <w:r>
+        <w:t xml:space="preserve"> belum dicentang → </w:t>
+      </w:r>
+      <w:r>
+        <w:rPr>
+          <w:rFonts w:ascii="Consolas" w:cs="Consolas" w:eastAsia="Consolas" w:hAnsi="Consolas"/>
+          <w:color w:val="1B2A4A"/>
+          <w:sz w:val="19"/>
+          <w:szCs w:val="19"/>
+        </w:rPr>
+        <w:t xml:space="preserve">st.warning</w:t>
+      </w:r>
+      <w:r>
+        <w:t xml:space="preserve"> dan </w:t>
+      </w:r>
+      <w:r>
+        <w:rPr>
+          <w:b/>
+          <w:bCs/>
+        </w:rPr>
+        <w:t xml:space="preserve">jangan</w:t>
+      </w:r>
+      <w:r>
+        <w:t xml:space="preserve"> menghapus apa pun. Jika sudah dicentang → panggil </w:t>
+      </w:r>
+      <w:r>
+        <w:rPr>
+          <w:rFonts w:ascii="Consolas" w:cs="Consolas" w:eastAsia="Consolas" w:hAnsi="Consolas"/>
+          <w:color w:val="1B2A4A"/>
+          <w:sz w:val="19"/>
+          <w:szCs w:val="19"/>
+        </w:rPr>
+        <w:t xml:space="preserve">database.hapus_produk(id_hapus)</w:t>
+      </w:r>
+      <w:r>
+        <w:t xml:space="preserve">, tangani hasil 0 dan </w:t>
+      </w:r>
+      <w:r>
+        <w:rPr>
+          <w:rFonts w:ascii="Consolas" w:cs="Consolas" w:eastAsia="Consolas" w:hAnsi="Consolas"/>
+          <w:color w:val="1B2A4A"/>
+          <w:sz w:val="19"/>
+          <w:szCs w:val="19"/>
+        </w:rPr>
+        <w:t xml:space="preserve">sqlite3.IntegrityError</w:t>
+      </w:r>
+      <w:r>
+        <w:t xml:space="preserve">.</w:t>
+      </w:r>
+    </w:p>
+    <w:tbl>
+      <w:tblPr>
+        <w:tblW w:type="dxa" w:w="9638"/>
+        <w:tblBorders>
+          <w:top w:val="single" w:color="auto" w:sz="4"/>
+          <w:left w:val="single" w:color="auto" w:sz="4"/>
+          <w:bottom w:val="single" w:color="auto" w:sz="4"/>
+          <w:right w:val="single" w:color="auto" w:sz="4"/>
+          <w:insideH w:val="single" w:color="auto" w:sz="4"/>
+          <w:insideV w:val="single" w:color="auto" w:sz="4"/>
+        </w:tblBorders>
+      </w:tblPr>
+      <w:tblGrid>
+        <w:gridCol w:w="9638"/>
+      </w:tblGrid>
+      <w:tr>
+        <w:trPr>
+          <w:trHeight w:val="2700" w:hRule="exact"/>
+        </w:trPr>
+        <w:tc>
+          <w:tcPr>
+            <w:tcW w:type="dxa" w:w="9638"/>
+            <w:tcBorders>
+              <w:top w:val="single" w:color="9AA8BC" w:sz="4"/>
+              <w:left w:val="single" w:color="9AA8BC" w:sz="4"/>
+              <w:bottom w:val="single" w:color="9AA8BC" w:sz="4"/>
+              <w:right w:val="single" w:color="9AA8BC" w:sz="4"/>
+            </w:tcBorders>
+            <w:tcMar>
+              <w:top w:type="dxa" w:w="80"/>
+              <w:left w:type="dxa" w:w="160"/>
+              <w:bottom w:type="dxa" w:w="80"/>
+              <w:right w:type="dxa" w:w="160"/>
+            </w:tcMar>
+          </w:tcPr>
+          <w:p>
+            <w:r>
+              <w:rPr>
+                <w:i/>
+                <w:iCs/>
+                <w:color w:val="5B6B82"/>
+                <w:sz w:val="17"/>
+                <w:szCs w:val="17"/>
+              </w:rPr>
+              <w:t xml:space="preserve">Tulis kode pengganti st.info pada bagian hapus di sini, lalu salin ke app.py.</w:t>
+            </w:r>
+          </w:p>
+        </w:tc>
+      </w:tr>
+    </w:tbl>
+    <w:p>
+      <w:pPr>
+        <w:spacing w:after="60"/>
+      </w:pPr>
+    </w:p>
+    <w:p>
+      <w:pPr>
+        <w:spacing w:after="100"/>
+      </w:pPr>
+      <w:r>
+        <w:t xml:space="preserve">Simpan </w:t>
+      </w:r>
+      <w:r>
+        <w:rPr>
+          <w:rFonts w:ascii="Consolas" w:cs="Consolas" w:eastAsia="Consolas" w:hAnsi="Consolas"/>
+          <w:color w:val="1B2A4A"/>
+          <w:sz w:val="19"/>
+          <w:szCs w:val="19"/>
+        </w:rPr>
+        <w:t xml:space="preserve">app.py</w:t>
+      </w:r>
+      <w:r>
+        <w:t xml:space="preserve">, lalu klik </w:t>
+      </w:r>
+      <w:r>
+        <w:rPr>
+          <w:b/>
+          <w:bCs/>
+        </w:rPr>
+        <w:t xml:space="preserve">Rerun</w:t>
+      </w:r>
+      <w:r>
+        <w:t xml:space="preserve"> di pojok kanan atas halaman atau tekan </w:t>
+      </w:r>
+      <w:r>
+        <w:rPr>
+          <w:b/>
+          <w:bCs/>
+        </w:rPr>
+        <w:t xml:space="preserve">R</w:t>
+      </w:r>
+      <w:r>
+        <w:t xml:space="preserve"> agar perubahan kode terbaca.</w:t>
+      </w:r>
+    </w:p>
+    <w:tbl>
+      <w:tblPr>
+        <w:tblW w:type="dxa" w:w="9638"/>
+        <w:tblBorders>
+          <w:top w:val="single" w:color="auto" w:sz="4"/>
+          <w:left w:val="single" w:color="auto" w:sz="4"/>
+          <w:bottom w:val="single" w:color="auto" w:sz="4"/>
+          <w:right w:val="single" w:color="auto" w:sz="4"/>
+          <w:insideH w:val="single" w:color="auto" w:sz="4"/>
+          <w:insideV w:val="single" w:color="auto" w:sz="4"/>
+        </w:tblBorders>
+      </w:tblPr>
+      <w:tblGrid>
+        <w:gridCol w:w="9638"/>
+      </w:tblGrid>
+      <w:tr>
+        <w:trPr>
+          <w:cantSplit/>
+        </w:trPr>
+        <w:tc>
+          <w:tcPr>
+            <w:tcW w:type="dxa" w:w="9638"/>
+            <w:tcBorders>
               <w:top w:val="single" w:color="2E9E6B" w:sz="4"/>
               <w:left w:val="single" w:color="2E9E6B" w:sz="4"/>
               <w:bottom w:val="single" w:color="2E9E6B" w:sz="4"/>
@@ -8622,7 +9079,7 @@
               <w:t xml:space="preserve">☐  </w:t>
             </w:r>
             <w:r>
-              <w:t xml:space="preserve">Menu tampil, dan menu 1 menampilkan tiga produk data awal.</w:t>
+              <w:t xml:space="preserve">Halaman Kelola Produk menampilkan tiga produk data awal; ubah harga dan hapus tidak lagi menampilkan pesan “belum dilengkapi”.</w:t>
             </w:r>
           </w:p>
         </w:tc>
@@ -8647,7 +9104,7 @@
           <w:sz w:val="24"/>
           <w:szCs w:val="24"/>
         </w:rPr>
-        <w:t xml:space="preserve">B4. Uji silang empat skenario</w:t>
+        <w:t xml:space="preserve">B4. Uji silang delapan skenario</w:t>
       </w:r>
       <w:r>
         <w:rPr>
@@ -8665,7 +9122,17 @@
         <w:spacing w:after="100"/>
       </w:pPr>
       <w:r>
-        <w:t xml:space="preserve">Jalankan setiap skenario berurutan memakai main.py. Setelah setiap skenario, pilih menu 1 untuk memeriksa daftar. Tulis hasil yang benar-benar Anda lihat.</w:t>
+        <w:t xml:space="preserve">Jalankan setiap skenario berurutan di halaman Streamlit. Setelah setiap aksi, periksa tabel </w:t>
+      </w:r>
+      <w:r>
+        <w:rPr>
+          <w:b/>
+          <w:bCs/>
+        </w:rPr>
+        <w:t xml:space="preserve">Daftar produk</w:t>
+      </w:r>
+      <w:r>
+        <w:t xml:space="preserve"> di bawah halaman. Tulis hasil yang benar-benar Anda lihat, dan ambil tangkapan layar skenario 1, 4a, dan 6.</w:t>
       </w:r>
     </w:p>
     <w:tbl>
@@ -8934,7 +9401,7 @@
                 <w:sz w:val="19"/>
                 <w:szCs w:val="19"/>
               </w:rPr>
-              <w:t xml:space="preserve">“Produk tersimpan.”, muncul dengan ID baru</w:t>
+              <w:t xml:space="preserve">Pesan hijau “Produk Penghapus tersimpan.”; muncul dengan ID baru</w:t>
             </w:r>
           </w:p>
         </w:tc>
@@ -9081,7 +9548,7 @@
                 <w:sz w:val="19"/>
                 <w:szCs w:val="19"/>
               </w:rPr>
-              <w:t xml:space="preserve">“Harga diubah.”, harga Pulpen 3500</w:t>
+              <w:t xml:space="preserve">Pesan berhasil; harga Pulpen 3500 di tabel</w:t>
             </w:r>
           </w:p>
         </w:tc>
@@ -9228,7 +9695,7 @@
                 <w:sz w:val="19"/>
                 <w:szCs w:val="19"/>
               </w:rPr>
-              <w:t xml:space="preserve">“ID tidak ditemukan.”</w:t>
+              <w:t xml:space="preserve">Pesan kuning “ID 999 tidak ditemukan.”</w:t>
             </w:r>
           </w:p>
         </w:tc>
@@ -9347,7 +9814,7 @@
                 <w:sz w:val="19"/>
                 <w:szCs w:val="19"/>
               </w:rPr>
-              <w:t xml:space="preserve">Hapus ID 1 (Buku Tulis, sudah punya transaksi)</w:t>
+              <w:t xml:space="preserve">Hapus ID 1 (Buku Tulis, sudah punya transaksi), konfirmasi dicentang</w:t>
             </w:r>
           </w:p>
         </w:tc>
@@ -9375,7 +9842,7 @@
                 <w:sz w:val="19"/>
                 <w:szCs w:val="19"/>
               </w:rPr>
-              <w:t xml:space="preserve">Database menolak: FOREIGN KEY constraint failed</w:t>
+              <w:t xml:space="preserve">Pesan merah: FOREIGN KEY constraint failed; data utuh</w:t>
             </w:r>
           </w:p>
         </w:tc>
@@ -9494,7 +9961,7 @@
                 <w:sz w:val="19"/>
                 <w:szCs w:val="19"/>
               </w:rPr>
-              <w:t xml:space="preserve">Hapus ID 3 (Map Plastik)</w:t>
+              <w:t xml:space="preserve">Hapus ID 3 (Map Plastik), konfirmasi dicentang</w:t>
             </w:r>
           </w:p>
         </w:tc>
@@ -9522,7 +9989,7 @@
                 <w:sz w:val="19"/>
                 <w:szCs w:val="19"/>
               </w:rPr>
-              <w:t xml:space="preserve">“Produk dihapus.”, produk lain utuh</w:t>
+              <w:t xml:space="preserve">Pesan berhasil; produk lain utuh</w:t>
             </w:r>
           </w:p>
         </w:tc>
@@ -9641,7 +10108,7 @@
                 <w:sz w:val="19"/>
                 <w:szCs w:val="19"/>
               </w:rPr>
-              <w:t xml:space="preserve">Tambah dengan harga abc</w:t>
+              <w:t xml:space="preserve">Tambah dengan nama kosong / hanya spasi</w:t>
             </w:r>
           </w:p>
         </w:tc>
@@ -9669,7 +10136,7 @@
                 <w:sz w:val="19"/>
                 <w:szCs w:val="19"/>
               </w:rPr>
-              <w:t xml:space="preserve">“Harus diisi angka bulat.”, program tetap jalan</w:t>
+              <w:t xml:space="preserve">“Nama produk wajib diisi.” (validasi Python)</w:t>
             </w:r>
           </w:p>
         </w:tc>
@@ -9816,7 +10283,301 @@
                 <w:sz w:val="19"/>
                 <w:szCs w:val="19"/>
               </w:rPr>
-              <w:t xml:space="preserve">Database menolak: CHECK constraint failed</w:t>
+              <w:t xml:space="preserve">Pesan merah: CHECK constraint failed</w:t>
+            </w:r>
+          </w:p>
+        </w:tc>
+        <w:tc>
+          <w:tcPr>
+            <w:tcW w:type="dxa" w:w="2418"/>
+            <w:tcBorders>
+              <w:top w:val="single" w:color="C9D8EC" w:sz="4"/>
+              <w:left w:val="single" w:color="C9D8EC" w:sz="4"/>
+              <w:bottom w:val="single" w:color="C9D8EC" w:sz="4"/>
+              <w:right w:val="single" w:color="C9D8EC" w:sz="4"/>
+            </w:tcBorders>
+            <w:shd w:fill="FFFFFF" w:color="auto" w:val="clear"/>
+            <w:tcMar>
+              <w:top w:type="dxa" w:w="70"/>
+              <w:left w:type="dxa" w:w="110"/>
+              <w:bottom w:type="dxa" w:w="70"/>
+              <w:right w:type="dxa" w:w="110"/>
+            </w:tcMar>
+            <w:vAlign w:val="center"/>
+          </w:tcPr>
+          <w:p>
+            <w:r>
+              <w:rPr>
+                <w:sz w:val="19"/>
+                <w:szCs w:val="19"/>
+              </w:rPr>
+              <w:t xml:space="preserve"/>
+            </w:r>
+          </w:p>
+        </w:tc>
+        <w:tc>
+          <w:tcPr>
+            <w:tcW w:type="dxa" w:w="2000"/>
+            <w:tcBorders>
+              <w:top w:val="single" w:color="C9D8EC" w:sz="4"/>
+              <w:left w:val="single" w:color="C9D8EC" w:sz="4"/>
+              <w:bottom w:val="single" w:color="C9D8EC" w:sz="4"/>
+              <w:right w:val="single" w:color="C9D8EC" w:sz="4"/>
+            </w:tcBorders>
+            <w:shd w:fill="FFFFFF" w:color="auto" w:val="clear"/>
+            <w:tcMar>
+              <w:top w:type="dxa" w:w="70"/>
+              <w:left w:type="dxa" w:w="110"/>
+              <w:bottom w:type="dxa" w:w="70"/>
+              <w:right w:type="dxa" w:w="110"/>
+            </w:tcMar>
+            <w:vAlign w:val="center"/>
+          </w:tcPr>
+          <w:p>
+            <w:r>
+              <w:rPr>
+                <w:sz w:val="19"/>
+                <w:szCs w:val="19"/>
+              </w:rPr>
+              <w:t xml:space="preserve">☐ Ya  ☐ Tidak</w:t>
+            </w:r>
+          </w:p>
+        </w:tc>
+      </w:tr>
+      <w:tr>
+        <w:trPr>
+          <w:cantSplit/>
+          <w:tblHeader w:val="false"/>
+          <w:trHeight w:val="640" w:hRule="atLeast"/>
+        </w:trPr>
+        <w:tc>
+          <w:tcPr>
+            <w:tcW w:type="dxa" w:w="520"/>
+            <w:tcBorders>
+              <w:top w:val="single" w:color="C9D8EC" w:sz="4"/>
+              <w:left w:val="single" w:color="C9D8EC" w:sz="4"/>
+              <w:bottom w:val="single" w:color="C9D8EC" w:sz="4"/>
+              <w:right w:val="single" w:color="C9D8EC" w:sz="4"/>
+            </w:tcBorders>
+            <w:shd w:fill="FFFFFF" w:color="auto" w:val="clear"/>
+            <w:tcMar>
+              <w:top w:type="dxa" w:w="70"/>
+              <w:left w:type="dxa" w:w="110"/>
+              <w:bottom w:type="dxa" w:w="70"/>
+              <w:right w:type="dxa" w:w="110"/>
+            </w:tcMar>
+            <w:vAlign w:val="center"/>
+          </w:tcPr>
+          <w:p>
+            <w:r>
+              <w:rPr>
+                <w:sz w:val="19"/>
+                <w:szCs w:val="19"/>
+              </w:rPr>
+              <w:t xml:space="preserve">7</w:t>
+            </w:r>
+          </w:p>
+        </w:tc>
+        <w:tc>
+          <w:tcPr>
+            <w:tcW w:type="dxa" w:w="2300"/>
+            <w:tcBorders>
+              <w:top w:val="single" w:color="C9D8EC" w:sz="4"/>
+              <w:left w:val="single" w:color="C9D8EC" w:sz="4"/>
+              <w:bottom w:val="single" w:color="C9D8EC" w:sz="4"/>
+              <w:right w:val="single" w:color="C9D8EC" w:sz="4"/>
+            </w:tcBorders>
+            <w:shd w:fill="FFFFFF" w:color="auto" w:val="clear"/>
+            <w:tcMar>
+              <w:top w:type="dxa" w:w="70"/>
+              <w:left w:type="dxa" w:w="110"/>
+              <w:bottom w:type="dxa" w:w="70"/>
+              <w:right w:type="dxa" w:w="110"/>
+            </w:tcMar>
+            <w:vAlign w:val="center"/>
+          </w:tcPr>
+          <w:p>
+            <w:r>
+              <w:rPr>
+                <w:sz w:val="19"/>
+                <w:szCs w:val="19"/>
+              </w:rPr>
+              <w:t xml:space="preserve">Hapus ID 2 tanpa mencentang konfirmasi</w:t>
+            </w:r>
+          </w:p>
+        </w:tc>
+        <w:tc>
+          <w:tcPr>
+            <w:tcW w:type="dxa" w:w="2400"/>
+            <w:tcBorders>
+              <w:top w:val="single" w:color="C9D8EC" w:sz="4"/>
+              <w:left w:val="single" w:color="C9D8EC" w:sz="4"/>
+              <w:bottom w:val="single" w:color="C9D8EC" w:sz="4"/>
+              <w:right w:val="single" w:color="C9D8EC" w:sz="4"/>
+            </w:tcBorders>
+            <w:shd w:fill="FFFFFF" w:color="auto" w:val="clear"/>
+            <w:tcMar>
+              <w:top w:type="dxa" w:w="70"/>
+              <w:left w:type="dxa" w:w="110"/>
+              <w:bottom w:type="dxa" w:w="70"/>
+              <w:right w:type="dxa" w:w="110"/>
+            </w:tcMar>
+            <w:vAlign w:val="center"/>
+          </w:tcPr>
+          <w:p>
+            <w:r>
+              <w:rPr>
+                <w:sz w:val="19"/>
+                <w:szCs w:val="19"/>
+              </w:rPr>
+              <w:t xml:space="preserve">Pesan peringatan; tidak ada yang terhapus</w:t>
+            </w:r>
+          </w:p>
+        </w:tc>
+        <w:tc>
+          <w:tcPr>
+            <w:tcW w:type="dxa" w:w="2418"/>
+            <w:tcBorders>
+              <w:top w:val="single" w:color="C9D8EC" w:sz="4"/>
+              <w:left w:val="single" w:color="C9D8EC" w:sz="4"/>
+              <w:bottom w:val="single" w:color="C9D8EC" w:sz="4"/>
+              <w:right w:val="single" w:color="C9D8EC" w:sz="4"/>
+            </w:tcBorders>
+            <w:shd w:fill="FFFFFF" w:color="auto" w:val="clear"/>
+            <w:tcMar>
+              <w:top w:type="dxa" w:w="70"/>
+              <w:left w:type="dxa" w:w="110"/>
+              <w:bottom w:type="dxa" w:w="70"/>
+              <w:right w:type="dxa" w:w="110"/>
+            </w:tcMar>
+            <w:vAlign w:val="center"/>
+          </w:tcPr>
+          <w:p>
+            <w:r>
+              <w:rPr>
+                <w:sz w:val="19"/>
+                <w:szCs w:val="19"/>
+              </w:rPr>
+              <w:t xml:space="preserve"/>
+            </w:r>
+          </w:p>
+        </w:tc>
+        <w:tc>
+          <w:tcPr>
+            <w:tcW w:type="dxa" w:w="2000"/>
+            <w:tcBorders>
+              <w:top w:val="single" w:color="C9D8EC" w:sz="4"/>
+              <w:left w:val="single" w:color="C9D8EC" w:sz="4"/>
+              <w:bottom w:val="single" w:color="C9D8EC" w:sz="4"/>
+              <w:right w:val="single" w:color="C9D8EC" w:sz="4"/>
+            </w:tcBorders>
+            <w:shd w:fill="FFFFFF" w:color="auto" w:val="clear"/>
+            <w:tcMar>
+              <w:top w:type="dxa" w:w="70"/>
+              <w:left w:type="dxa" w:w="110"/>
+              <w:bottom w:type="dxa" w:w="70"/>
+              <w:right w:type="dxa" w:w="110"/>
+            </w:tcMar>
+            <w:vAlign w:val="center"/>
+          </w:tcPr>
+          <w:p>
+            <w:r>
+              <w:rPr>
+                <w:sz w:val="19"/>
+                <w:szCs w:val="19"/>
+              </w:rPr>
+              <w:t xml:space="preserve">☐ Ya  ☐ Tidak</w:t>
+            </w:r>
+          </w:p>
+        </w:tc>
+      </w:tr>
+      <w:tr>
+        <w:trPr>
+          <w:cantSplit/>
+          <w:tblHeader w:val="false"/>
+          <w:trHeight w:val="640" w:hRule="atLeast"/>
+        </w:trPr>
+        <w:tc>
+          <w:tcPr>
+            <w:tcW w:type="dxa" w:w="520"/>
+            <w:tcBorders>
+              <w:top w:val="single" w:color="C9D8EC" w:sz="4"/>
+              <w:left w:val="single" w:color="C9D8EC" w:sz="4"/>
+              <w:bottom w:val="single" w:color="C9D8EC" w:sz="4"/>
+              <w:right w:val="single" w:color="C9D8EC" w:sz="4"/>
+            </w:tcBorders>
+            <w:shd w:fill="FFFFFF" w:color="auto" w:val="clear"/>
+            <w:tcMar>
+              <w:top w:type="dxa" w:w="70"/>
+              <w:left w:type="dxa" w:w="110"/>
+              <w:bottom w:type="dxa" w:w="70"/>
+              <w:right w:type="dxa" w:w="110"/>
+            </w:tcMar>
+            <w:vAlign w:val="center"/>
+          </w:tcPr>
+          <w:p>
+            <w:r>
+              <w:rPr>
+                <w:sz w:val="19"/>
+                <w:szCs w:val="19"/>
+              </w:rPr>
+              <w:t xml:space="preserve">8</w:t>
+            </w:r>
+          </w:p>
+        </w:tc>
+        <w:tc>
+          <w:tcPr>
+            <w:tcW w:type="dxa" w:w="2300"/>
+            <w:tcBorders>
+              <w:top w:val="single" w:color="C9D8EC" w:sz="4"/>
+              <w:left w:val="single" w:color="C9D8EC" w:sz="4"/>
+              <w:bottom w:val="single" w:color="C9D8EC" w:sz="4"/>
+              <w:right w:val="single" w:color="C9D8EC" w:sz="4"/>
+            </w:tcBorders>
+            <w:shd w:fill="FFFFFF" w:color="auto" w:val="clear"/>
+            <w:tcMar>
+              <w:top w:type="dxa" w:w="70"/>
+              <w:left w:type="dxa" w:w="110"/>
+              <w:bottom w:type="dxa" w:w="70"/>
+              <w:right w:type="dxa" w:w="110"/>
+            </w:tcMar>
+            <w:vAlign w:val="center"/>
+          </w:tcPr>
+          <w:p>
+            <w:r>
+              <w:rPr>
+                <w:sz w:val="19"/>
+                <w:szCs w:val="19"/>
+              </w:rPr>
+              <w:t xml:space="preserve">Hentikan aplikasi (Ctrl+C), jalankan lagi</w:t>
+            </w:r>
+          </w:p>
+        </w:tc>
+        <w:tc>
+          <w:tcPr>
+            <w:tcW w:type="dxa" w:w="2400"/>
+            <w:tcBorders>
+              <w:top w:val="single" w:color="C9D8EC" w:sz="4"/>
+              <w:left w:val="single" w:color="C9D8EC" w:sz="4"/>
+              <w:bottom w:val="single" w:color="C9D8EC" w:sz="4"/>
+              <w:right w:val="single" w:color="C9D8EC" w:sz="4"/>
+            </w:tcBorders>
+            <w:shd w:fill="FFFFFF" w:color="auto" w:val="clear"/>
+            <w:tcMar>
+              <w:top w:type="dxa" w:w="70"/>
+              <w:left w:type="dxa" w:w="110"/>
+              <w:bottom w:type="dxa" w:w="70"/>
+              <w:right w:type="dxa" w:w="110"/>
+            </w:tcMar>
+            <w:vAlign w:val="center"/>
+          </w:tcPr>
+          <w:p>
+            <w:r>
+              <w:rPr>
+                <w:sz w:val="19"/>
+                <w:szCs w:val="19"/>
+              </w:rPr>
+              <w:t xml:space="preserve">Hasil skenario 1–4b tetap ada di tabel</w:t>
             </w:r>
           </w:p>
         </w:tc>
@@ -9882,6 +10643,46 @@
       <w:pPr>
         <w:spacing w:after="60"/>
       </w:pPr>
+    </w:p>
+    <w:p>
+      <w:pPr>
+        <w:spacing w:after="100"/>
+      </w:pPr>
+      <w:r>
+        <w:t xml:space="preserve">Skenario 5 ditolak oleh </w:t>
+      </w:r>
+      <w:r>
+        <w:rPr>
+          <w:b/>
+          <w:bCs/>
+        </w:rPr>
+        <w:t xml:space="preserve">Python</w:t>
+      </w:r>
+      <w:r>
+        <w:t xml:space="preserve"> (lapis depan); skenario 6 ditolak oleh </w:t>
+      </w:r>
+      <w:r>
+        <w:rPr>
+          <w:b/>
+          <w:bCs/>
+        </w:rPr>
+        <w:t xml:space="preserve">database</w:t>
+      </w:r>
+      <w:r>
+        <w:t xml:space="preserve"> (lapis belakang). Kolom harga sengaja tidak diberi batas minimum agar aturan </w:t>
+      </w:r>
+      <w:r>
+        <w:rPr>
+          <w:rFonts w:ascii="Consolas" w:cs="Consolas" w:eastAsia="Consolas" w:hAnsi="Consolas"/>
+          <w:color w:val="1B2A4A"/>
+          <w:sz w:val="19"/>
+          <w:szCs w:val="19"/>
+        </w:rPr>
+        <w:t xml:space="preserve">CHECK</w:t>
+      </w:r>
+      <w:r>
+        <w:t xml:space="preserve"> dapat dibuktikan.</w:t>
+      </w:r>
     </w:p>
     <w:p>
       <w:pPr>
@@ -9945,19 +10746,7 @@
         <w:spacing w:after="100"/>
       </w:pPr>
       <w:r>
-        <w:t xml:space="preserve">Minggu depan </w:t>
-      </w:r>
-      <w:r>
-        <w:rPr>
-          <w:rFonts w:ascii="Consolas" w:cs="Consolas" w:eastAsia="Consolas" w:hAnsi="Consolas"/>
-          <w:color w:val="1B2A4A"/>
-          <w:sz w:val="19"/>
-          <w:szCs w:val="19"/>
-        </w:rPr>
-        <w:t xml:space="preserve">main.py</w:t>
-      </w:r>
-      <w:r>
-        <w:t xml:space="preserve"> diganti form Streamlit. Bagian mana dari pekerjaan hari ini yang menurut Anda tidak perlu diubah sama sekali, dan mengapa?</w:t>
+        <w:t xml:space="preserve">Minggu 7 akan menambah fitur catat penjualan dan laporan di aplikasi Streamlit. Bagian mana dari pekerjaan hari ini yang tidak perlu diubah sama sekali, dan mengapa? Pada skenario 5 dan 6, lapis mana yang menolak data dan mengapa keduanya diperlukan?</w:t>
       </w:r>
     </w:p>
     <w:p>
@@ -10067,7 +10856,7 @@
                 <w:sz w:val="19"/>
                 <w:szCs w:val="19"/>
               </w:rPr>
-              <w:t xml:space="preserve">Pesan di terminal</w:t>
+              <w:t xml:space="preserve">Pesan di terminal / browser</w:t>
             </w:r>
           </w:p>
         </w:tc>
@@ -10198,7 +10987,7 @@
                 <w:sz w:val="19"/>
                 <w:szCs w:val="19"/>
               </w:rPr>
-              <w:t xml:space="preserve">database is locked</w:t>
+              <w:t xml:space="preserve">No module named streamlit</w:t>
             </w:r>
           </w:p>
         </w:tc>
@@ -10226,7 +11015,7 @@
                 <w:sz w:val="19"/>
                 <w:szCs w:val="19"/>
               </w:rPr>
-              <w:t xml:space="preserve">Ada program lain yang masih membuka kasir.db (misalnya SQLite Viewer atau program yang belum ditutup). Tutup lalu coba lagi.</w:t>
+              <w:t xml:space="preserve">Streamlit belum terpasang. Jalankan python -m pip install streamlit dengan perintah Python yang sama (python atau py).</w:t>
             </w:r>
           </w:p>
         </w:tc>
@@ -10262,6 +11051,198 @@
                 <w:sz w:val="19"/>
                 <w:szCs w:val="19"/>
               </w:rPr>
+              <w:t xml:space="preserve">'streamlit' is not recognized</w:t>
+            </w:r>
+          </w:p>
+        </w:tc>
+        <w:tc>
+          <w:tcPr>
+            <w:tcW w:type="dxa" w:w="6338"/>
+            <w:tcBorders>
+              <w:top w:val="single" w:color="C9D8EC" w:sz="4"/>
+              <w:left w:val="single" w:color="C9D8EC" w:sz="4"/>
+              <w:bottom w:val="single" w:color="C9D8EC" w:sz="4"/>
+              <w:right w:val="single" w:color="C9D8EC" w:sz="4"/>
+            </w:tcBorders>
+            <w:shd w:fill="FFFFFF" w:color="auto" w:val="clear"/>
+            <w:tcMar>
+              <w:top w:type="dxa" w:w="70"/>
+              <w:left w:type="dxa" w:w="110"/>
+              <w:bottom w:type="dxa" w:w="70"/>
+              <w:right w:type="dxa" w:w="110"/>
+            </w:tcMar>
+            <w:vAlign w:val="center"/>
+          </w:tcPr>
+          <w:p>
+            <w:r>
+              <w:rPr>
+                <w:sz w:val="19"/>
+                <w:szCs w:val="19"/>
+              </w:rPr>
+              <w:t xml:space="preserve">Gunakan python -m streamlit run app.py, bukan streamlit run app.py.</w:t>
+            </w:r>
+          </w:p>
+        </w:tc>
+      </w:tr>
+      <w:tr>
+        <w:trPr>
+          <w:cantSplit/>
+          <w:tblHeader w:val="false"/>
+        </w:trPr>
+        <w:tc>
+          <w:tcPr>
+            <w:tcW w:type="dxa" w:w="3300"/>
+            <w:tcBorders>
+              <w:top w:val="single" w:color="C9D8EC" w:sz="4"/>
+              <w:left w:val="single" w:color="C9D8EC" w:sz="4"/>
+              <w:bottom w:val="single" w:color="C9D8EC" w:sz="4"/>
+              <w:right w:val="single" w:color="C9D8EC" w:sz="4"/>
+            </w:tcBorders>
+            <w:shd w:fill="FFFFFF" w:color="auto" w:val="clear"/>
+            <w:tcMar>
+              <w:top w:type="dxa" w:w="70"/>
+              <w:left w:type="dxa" w:w="110"/>
+              <w:bottom w:type="dxa" w:w="70"/>
+              <w:right w:type="dxa" w:w="110"/>
+            </w:tcMar>
+            <w:vAlign w:val="center"/>
+          </w:tcPr>
+          <w:p>
+            <w:r>
+              <w:rPr>
+                <w:rFonts w:ascii="Consolas" w:cs="Consolas" w:eastAsia="Consolas" w:hAnsi="Consolas"/>
+                <w:color w:val="1B2A4A"/>
+                <w:sz w:val="19"/>
+                <w:szCs w:val="19"/>
+              </w:rPr>
+              <w:t xml:space="preserve">NotImplementedError: hapus_produk()</w:t>
+            </w:r>
+          </w:p>
+        </w:tc>
+        <w:tc>
+          <w:tcPr>
+            <w:tcW w:type="dxa" w:w="6338"/>
+            <w:tcBorders>
+              <w:top w:val="single" w:color="C9D8EC" w:sz="4"/>
+              <w:left w:val="single" w:color="C9D8EC" w:sz="4"/>
+              <w:bottom w:val="single" w:color="C9D8EC" w:sz="4"/>
+              <w:right w:val="single" w:color="C9D8EC" w:sz="4"/>
+            </w:tcBorders>
+            <w:shd w:fill="FFFFFF" w:color="auto" w:val="clear"/>
+            <w:tcMar>
+              <w:top w:type="dxa" w:w="70"/>
+              <w:left w:type="dxa" w:w="110"/>
+              <w:bottom w:type="dxa" w:w="70"/>
+              <w:right w:type="dxa" w:w="110"/>
+            </w:tcMar>
+            <w:vAlign w:val="center"/>
+          </w:tcPr>
+          <w:p>
+            <w:r>
+              <w:rPr>
+                <w:sz w:val="19"/>
+                <w:szCs w:val="19"/>
+              </w:rPr>
+              <w:t xml:space="preserve">Latihan B2 belum dikerjakan. Lengkapi hapus_produk() di database.py.</w:t>
+            </w:r>
+          </w:p>
+        </w:tc>
+      </w:tr>
+      <w:tr>
+        <w:trPr>
+          <w:cantSplit/>
+          <w:tblHeader w:val="false"/>
+        </w:trPr>
+        <w:tc>
+          <w:tcPr>
+            <w:tcW w:type="dxa" w:w="3300"/>
+            <w:tcBorders>
+              <w:top w:val="single" w:color="C9D8EC" w:sz="4"/>
+              <w:left w:val="single" w:color="C9D8EC" w:sz="4"/>
+              <w:bottom w:val="single" w:color="C9D8EC" w:sz="4"/>
+              <w:right w:val="single" w:color="C9D8EC" w:sz="4"/>
+            </w:tcBorders>
+            <w:shd w:fill="FFFFFF" w:color="auto" w:val="clear"/>
+            <w:tcMar>
+              <w:top w:type="dxa" w:w="70"/>
+              <w:left w:type="dxa" w:w="110"/>
+              <w:bottom w:type="dxa" w:w="70"/>
+              <w:right w:type="dxa" w:w="110"/>
+            </w:tcMar>
+            <w:vAlign w:val="center"/>
+          </w:tcPr>
+          <w:p>
+            <w:r>
+              <w:rPr>
+                <w:rFonts w:ascii="Consolas" w:cs="Consolas" w:eastAsia="Consolas" w:hAnsi="Consolas"/>
+                <w:color w:val="1B2A4A"/>
+                <w:sz w:val="19"/>
+                <w:szCs w:val="19"/>
+              </w:rPr>
+              <w:t xml:space="preserve">database is locked</w:t>
+            </w:r>
+          </w:p>
+        </w:tc>
+        <w:tc>
+          <w:tcPr>
+            <w:tcW w:type="dxa" w:w="6338"/>
+            <w:tcBorders>
+              <w:top w:val="single" w:color="C9D8EC" w:sz="4"/>
+              <w:left w:val="single" w:color="C9D8EC" w:sz="4"/>
+              <w:bottom w:val="single" w:color="C9D8EC" w:sz="4"/>
+              <w:right w:val="single" w:color="C9D8EC" w:sz="4"/>
+            </w:tcBorders>
+            <w:shd w:fill="FFFFFF" w:color="auto" w:val="clear"/>
+            <w:tcMar>
+              <w:top w:type="dxa" w:w="70"/>
+              <w:left w:type="dxa" w:w="110"/>
+              <w:bottom w:type="dxa" w:w="70"/>
+              <w:right w:type="dxa" w:w="110"/>
+            </w:tcMar>
+            <w:vAlign w:val="center"/>
+          </w:tcPr>
+          <w:p>
+            <w:r>
+              <w:rPr>
+                <w:sz w:val="19"/>
+                <w:szCs w:val="19"/>
+              </w:rPr>
+              <w:t xml:space="preserve">Ada program lain yang masih membuka kasir.db (misalnya SQLite Viewer). Tutup lalu coba lagi.</w:t>
+            </w:r>
+          </w:p>
+        </w:tc>
+      </w:tr>
+      <w:tr>
+        <w:trPr>
+          <w:cantSplit/>
+          <w:tblHeader w:val="false"/>
+        </w:trPr>
+        <w:tc>
+          <w:tcPr>
+            <w:tcW w:type="dxa" w:w="3300"/>
+            <w:tcBorders>
+              <w:top w:val="single" w:color="C9D8EC" w:sz="4"/>
+              <w:left w:val="single" w:color="C9D8EC" w:sz="4"/>
+              <w:bottom w:val="single" w:color="C9D8EC" w:sz="4"/>
+              <w:right w:val="single" w:color="C9D8EC" w:sz="4"/>
+            </w:tcBorders>
+            <w:shd w:fill="FFFFFF" w:color="auto" w:val="clear"/>
+            <w:tcMar>
+              <w:top w:type="dxa" w:w="70"/>
+              <w:left w:type="dxa" w:w="110"/>
+              <w:bottom w:type="dxa" w:w="70"/>
+              <w:right w:type="dxa" w:w="110"/>
+            </w:tcMar>
+            <w:vAlign w:val="center"/>
+          </w:tcPr>
+          <w:p>
+            <w:r>
+              <w:rPr>
+                <w:rFonts w:ascii="Consolas" w:cs="Consolas" w:eastAsia="Consolas" w:hAnsi="Consolas"/>
+                <w:color w:val="1B2A4A"/>
+                <w:sz w:val="19"/>
+                <w:szCs w:val="19"/>
+              </w:rPr>
               <w:t xml:space="preserve">No module named 'database'</w:t>
             </w:r>
           </w:p>
@@ -10290,7 +11271,7 @@
                 <w:sz w:val="19"/>
                 <w:szCs w:val="19"/>
               </w:rPr>
-              <w:t xml:space="preserve">database.py tidak satu folder dengan main.py, atau nama file salah ketik (database.py.txt).</w:t>
+              <w:t xml:space="preserve">database.py tidak satu folder dengan app.py, atau nama file salah ketik (database.py.txt).</w:t>
             </w:r>
           </w:p>
         </w:tc>
@@ -10762,7 +11743,7 @@
                 <w:sz w:val="19"/>
                 <w:szCs w:val="19"/>
               </w:rPr>
-              <w:t xml:space="preserve">main.py (atau app.py) berjalan; input salah tidak menghentikan program</w:t>
+              <w:t xml:space="preserve">app.py berjalan dengan python -m streamlit run app.py; keempat operasi CRUD bekerja dan input salah menampilkan pesan</w:t>
             </w:r>
           </w:p>
         </w:tc>
@@ -10824,7 +11805,7 @@
                 <w:sz w:val="19"/>
                 <w:szCs w:val="19"/>
               </w:rPr>
-              <w:t xml:space="preserve">Tabel A4 dan B4 terisi hasil asli, beserta refleksi</w:t>
+              <w:t xml:space="preserve">Tabel A4 dan B4 terisi hasil asli, tangkapan layar skenario 1, 4a, 6, beserta refleksi</w:t>
             </w:r>
           </w:p>
         </w:tc>
@@ -11151,6 +12132,24 @@
     </w:lvlOverride>
   </w:num>
   <w:num w:numId="5">
+    <w:abstractNumId w:val="6"/>
+    <w:lvlOverride w:ilvl="0">
+      <w:startOverride w:val="1"/>
+    </w:lvlOverride>
+  </w:num>
+  <w:num w:numId="6">
+    <w:abstractNumId w:val="6"/>
+    <w:lvlOverride w:ilvl="0">
+      <w:startOverride w:val="1"/>
+    </w:lvlOverride>
+  </w:num>
+  <w:num w:numId="7">
+    <w:abstractNumId w:val="6"/>
+    <w:lvlOverride w:ilvl="0">
+      <w:startOverride w:val="1"/>
+    </w:lvlOverride>
+  </w:num>
+  <w:num w:numId="8">
     <w:abstractNumId w:val="6"/>
     <w:lvlOverride w:ilvl="0">
       <w:startOverride w:val="1"/>

</xml_diff>